<commit_message>
Fix schema issue in acceptance test report
Co-Authored-By: Claude Opus 5.5 <noreply@anthropic.com>
Claude-Session: https://claude.ai/code/session_01DhfrxujFdtSZWrLQm5rNqB
</commit_message>
<xml_diff>
--- a/Акт_приемочных_испытаний_RU-EN-CN.docx
+++ b/Акт_приемочных_испытаний_RU-EN-CN.docx
@@ -205,7 +205,6 @@
                 <w:sz w:val="17"/>
                 <w:szCs w:val="17"/>
                 <w:highlight w:val="yellow"/>
-                <w:highlightCs w:val="yellow"/>
               </w:rPr>
               <w:t xml:space="preserve">[заполнить · to be filled · 待填写]</w:t>
             </w:r>
@@ -310,7 +309,6 @@
                 <w:sz w:val="17"/>
                 <w:szCs w:val="17"/>
                 <w:highlight w:val="yellow"/>
-                <w:highlightCs w:val="yellow"/>
               </w:rPr>
               <w:t xml:space="preserve">[заполнить · to be filled · 待填写]</w:t>
             </w:r>
@@ -415,7 +413,6 @@
                 <w:sz w:val="17"/>
                 <w:szCs w:val="17"/>
                 <w:highlight w:val="yellow"/>
-                <w:highlightCs w:val="yellow"/>
               </w:rPr>
               <w:t xml:space="preserve">[заполнить · to be filled · 待填写]</w:t>
             </w:r>
@@ -520,7 +517,6 @@
                 <w:sz w:val="17"/>
                 <w:szCs w:val="17"/>
                 <w:highlight w:val="yellow"/>
-                <w:highlightCs w:val="yellow"/>
               </w:rPr>
               <w:t xml:space="preserve">[заполнить · to be filled · 待填写]</w:t>
             </w:r>
@@ -544,7 +540,6 @@
                 <w:sz w:val="17"/>
                 <w:szCs w:val="17"/>
                 <w:highlight w:val="yellow"/>
-                <w:highlightCs w:val="yellow"/>
               </w:rPr>
               <w:t xml:space="preserve">[заполнить · to be filled · 待填写]</w:t>
             </w:r>
@@ -660,7 +655,6 @@
                 <w:sz w:val="17"/>
                 <w:szCs w:val="17"/>
                 <w:highlight w:val="yellow"/>
-                <w:highlightCs w:val="yellow"/>
               </w:rPr>
               <w:t xml:space="preserve">[заполнить · to be filled · 待填写]</w:t>
             </w:r>
@@ -687,7 +681,6 @@
                 <w:sz w:val="17"/>
                 <w:szCs w:val="17"/>
                 <w:highlight w:val="yellow"/>
-                <w:highlightCs w:val="yellow"/>
               </w:rPr>
               <w:t xml:space="preserve">[заполнить · to be filled · 待填写]</w:t>
             </w:r>
@@ -714,7 +707,6 @@
                 <w:sz w:val="17"/>
                 <w:szCs w:val="17"/>
                 <w:highlight w:val="yellow"/>
-                <w:highlightCs w:val="yellow"/>
               </w:rPr>
               <w:t xml:space="preserve">[заполнить · to be filled · 待填写]</w:t>
             </w:r>
@@ -819,7 +811,6 @@
                 <w:sz w:val="17"/>
                 <w:szCs w:val="17"/>
                 <w:highlight w:val="yellow"/>
-                <w:highlightCs w:val="yellow"/>
               </w:rPr>
               <w:t xml:space="preserve">[заполнить · to be filled · 待填写]</w:t>
             </w:r>
@@ -1396,7 +1387,6 @@
                 <w:sz w:val="15"/>
                 <w:szCs w:val="15"/>
                 <w:highlight w:val="yellow"/>
-                <w:highlightCs w:val="yellow"/>
               </w:rPr>
               <w:t xml:space="preserve">[заполнить · to be filled · 待填写]</w:t>
             </w:r>
@@ -1433,7 +1423,6 @@
                 <w:sz w:val="15"/>
                 <w:szCs w:val="15"/>
                 <w:highlight w:val="yellow"/>
-                <w:highlightCs w:val="yellow"/>
               </w:rPr>
               <w:t xml:space="preserve">[заполнить · to be filled · 待填写]</w:t>
             </w:r>
@@ -14835,7 +14824,6 @@
                 <w:sz w:val="15"/>
                 <w:szCs w:val="15"/>
                 <w:highlight w:val="yellow"/>
-                <w:highlightCs w:val="yellow"/>
               </w:rPr>
               <w:t xml:space="preserve">[заполнить · to be filled · 待填写]</w:t>
             </w:r>
@@ -14872,7 +14860,6 @@
                 <w:sz w:val="15"/>
                 <w:szCs w:val="15"/>
                 <w:highlight w:val="yellow"/>
-                <w:highlightCs w:val="yellow"/>
               </w:rPr>
               <w:t xml:space="preserve">[заполнить · to be filled · 待填写]</w:t>
             </w:r>
@@ -14909,7 +14896,6 @@
                 <w:sz w:val="15"/>
                 <w:szCs w:val="15"/>
                 <w:highlight w:val="yellow"/>
-                <w:highlightCs w:val="yellow"/>
               </w:rPr>
               <w:t xml:space="preserve">[заполнить · to be filled · 待填写]</w:t>
             </w:r>
@@ -19111,7 +19097,6 @@
         <w:sz w:val="14"/>
         <w:szCs w:val="14"/>
         <w:highlight w:val="yellow"/>
-        <w:highlightCs w:val="yellow"/>
       </w:rPr>
       <w:t xml:space="preserve">[заполнить · to be filled · 待填写]</w:t>
     </w:r>

</xml_diff>

<commit_message>
Acceptance test report: remove control cabinet documentation item
Co-Authored-By: Claude Opus 5.5 <noreply@anthropic.com>
Claude-Session: https://claude.ai/code/session_01DhfrxujFdtSZWrLQm5rNqB
</commit_message>
<xml_diff>
--- a/Акт_приемочных_испытаний_RU-EN-CN.docx
+++ b/Акт_приемочных_испытаний_RU-EN-CN.docx
@@ -1460,7 +1460,7 @@
                 <w:sz w:val="17"/>
                 <w:szCs w:val="17"/>
               </w:rPr>
-              <w:t xml:space="preserve">63</w:t>
+              <w:t xml:space="preserve">62</w:t>
             </w:r>
           </w:p>
         </w:tc>
@@ -1538,7 +1538,7 @@
                 <w:sz w:val="17"/>
                 <w:szCs w:val="17"/>
               </w:rPr>
-              <w:t xml:space="preserve">63</w:t>
+              <w:t xml:space="preserve">62</w:t>
             </w:r>
           </w:p>
         </w:tc>
@@ -1870,7 +1870,7 @@
                 <w:sz w:val="16"/>
                 <w:szCs w:val="16"/>
               </w:rPr>
-              <w:t xml:space="preserve">21</w:t>
+              <w:t xml:space="preserve">20</w:t>
             </w:r>
           </w:p>
           <w:p>
@@ -1887,7 +1887,7 @@
                 <w:sz w:val="16"/>
                 <w:szCs w:val="16"/>
               </w:rPr>
-              <w:t xml:space="preserve">Пункты 1.6–1.21 — документы раздела 1 программы FAT, не вошедшие в комплект, предъявленный Продавцом.</w:t>
+              <w:t xml:space="preserve">Пункты 1.6–1.20 — документы раздела 1 программы FAT, не вошедшие в комплект, предъявленный Продавцом.</w:t>
             </w:r>
           </w:p>
         </w:tc>
@@ -1932,7 +1932,7 @@
                 <w:sz w:val="16"/>
                 <w:szCs w:val="16"/>
               </w:rPr>
-              <w:t xml:space="preserve">21</w:t>
+              <w:t xml:space="preserve">20</w:t>
             </w:r>
           </w:p>
           <w:p>
@@ -1949,7 +1949,7 @@
                 <w:sz w:val="16"/>
                 <w:szCs w:val="16"/>
               </w:rPr>
-              <w:t xml:space="preserve">Items 1.6–1.21 are documents under section 1 of the FAT programme not included in the set presented by the Seller.</w:t>
+              <w:t xml:space="preserve">Items 1.6–1.20 are documents under section 1 of the FAT programme not included in the set presented by the Seller.</w:t>
             </w:r>
           </w:p>
         </w:tc>
@@ -1994,7 +1994,7 @@
                 <w:sz w:val="16"/>
                 <w:szCs w:val="16"/>
               </w:rPr>
-              <w:t xml:space="preserve">21</w:t>
+              <w:t xml:space="preserve">20</w:t>
             </w:r>
           </w:p>
           <w:p>
@@ -2011,7 +2011,7 @@
                 <w:sz w:val="16"/>
                 <w:szCs w:val="16"/>
               </w:rPr>
-              <w:t xml:space="preserve">第 1.6–1.21 项为 FAT 大纲第 1 章所列、卖方提交文件中缺少的文件。</w:t>
+              <w:t xml:space="preserve">第 1.6–1.20 项为 FAT 大纲第 1 章所列、卖方提交文件中缺少的文件。</w:t>
             </w:r>
           </w:p>
         </w:tc>
@@ -4760,7 +4760,7 @@
           </w:tcPr>
           <w:p>
             <w:pPr>
-              <w:spacing w:after="40" w:line="264"/>
+              <w:spacing w:after="0" w:line="264"/>
             </w:pPr>
             <w:r>
               <w:rPr>
@@ -4779,91 +4779,7 @@
                 <w:sz w:val="17"/>
                 <w:szCs w:val="17"/>
               </w:rPr>
-              <w:t xml:space="preserve">Документация на шкаф управления (п. 14 программы FAT):</w:t>
-            </w:r>
-          </w:p>
-          <w:p>
-            <w:pPr>
-              <w:spacing w:after="20" w:line="252"/>
-              <w:ind w:left="360" w:hanging="200"/>
-            </w:pPr>
-            <w:r>
-              <w:rPr>
-                <w:rFonts w:ascii="Calibri" w:cs="Calibri" w:eastAsia="Microsoft YaHei" w:hAnsi="Calibri"/>
-                <w:sz w:val="17"/>
-                <w:szCs w:val="17"/>
-              </w:rPr>
-              <w:t xml:space="preserve">–  электрические схемы;</w:t>
-            </w:r>
-          </w:p>
-          <w:p>
-            <w:pPr>
-              <w:spacing w:after="20" w:line="252"/>
-              <w:ind w:left="360" w:hanging="200"/>
-            </w:pPr>
-            <w:r>
-              <w:rPr>
-                <w:rFonts w:ascii="Calibri" w:cs="Calibri" w:eastAsia="Microsoft YaHei" w:hAnsi="Calibri"/>
-                <w:sz w:val="17"/>
-                <w:szCs w:val="17"/>
-              </w:rPr>
-              <w:t xml:space="preserve">–  кабельный журнал;</w:t>
-            </w:r>
-          </w:p>
-          <w:p>
-            <w:pPr>
-              <w:spacing w:after="20" w:line="252"/>
-              <w:ind w:left="360" w:hanging="200"/>
-            </w:pPr>
-            <w:r>
-              <w:rPr>
-                <w:rFonts w:ascii="Calibri" w:cs="Calibri" w:eastAsia="Microsoft YaHei" w:hAnsi="Calibri"/>
-                <w:sz w:val="17"/>
-                <w:szCs w:val="17"/>
-              </w:rPr>
-              <w:t xml:space="preserve">–  карта заземления;</w:t>
-            </w:r>
-          </w:p>
-          <w:p>
-            <w:pPr>
-              <w:spacing w:after="20" w:line="252"/>
-              <w:ind w:left="360" w:hanging="200"/>
-            </w:pPr>
-            <w:r>
-              <w:rPr>
-                <w:rFonts w:ascii="Calibri" w:cs="Calibri" w:eastAsia="Microsoft YaHei" w:hAnsi="Calibri"/>
-                <w:sz w:val="17"/>
-                <w:szCs w:val="17"/>
-              </w:rPr>
-              <w:t xml:space="preserve">–  перечень входов и выходов;</w:t>
-            </w:r>
-          </w:p>
-          <w:p>
-            <w:pPr>
-              <w:spacing w:after="20" w:line="252"/>
-              <w:ind w:left="360" w:hanging="200"/>
-            </w:pPr>
-            <w:r>
-              <w:rPr>
-                <w:rFonts w:ascii="Calibri" w:cs="Calibri" w:eastAsia="Microsoft YaHei" w:hAnsi="Calibri"/>
-                <w:sz w:val="17"/>
-                <w:szCs w:val="17"/>
-              </w:rPr>
-              <w:t xml:space="preserve">–  описание алгоритмов и блокировок;</w:t>
-            </w:r>
-          </w:p>
-          <w:p>
-            <w:pPr>
-              <w:spacing w:after="20" w:line="252"/>
-              <w:ind w:left="360" w:hanging="200"/>
-            </w:pPr>
-            <w:r>
-              <w:rPr>
-                <w:rFonts w:ascii="Calibri" w:cs="Calibri" w:eastAsia="Microsoft YaHei" w:hAnsi="Calibri"/>
-                <w:sz w:val="17"/>
-                <w:szCs w:val="17"/>
-              </w:rPr>
-              <w:t xml:space="preserve">–  протокол измерения сопротивления изоляции.</w:t>
+              <w:t xml:space="preserve">Программное обеспечение ПЛК и панели оператора (резервная копия) (п. 15 программы FAT).</w:t>
             </w:r>
           </w:p>
         </w:tc>
@@ -4886,7 +4802,7 @@
           </w:tcPr>
           <w:p>
             <w:pPr>
-              <w:spacing w:after="40" w:line="264"/>
+              <w:spacing w:after="0" w:line="264"/>
             </w:pPr>
             <w:r>
               <w:rPr>
@@ -4905,91 +4821,7 @@
                 <w:sz w:val="17"/>
                 <w:szCs w:val="17"/>
               </w:rPr>
-              <w:t xml:space="preserve">Control cabinet documentation (FAT programme, item 14):</w:t>
-            </w:r>
-          </w:p>
-          <w:p>
-            <w:pPr>
-              <w:spacing w:after="20" w:line="252"/>
-              <w:ind w:left="360" w:hanging="200"/>
-            </w:pPr>
-            <w:r>
-              <w:rPr>
-                <w:rFonts w:ascii="Calibri" w:cs="Calibri" w:eastAsia="Microsoft YaHei" w:hAnsi="Calibri"/>
-                <w:sz w:val="17"/>
-                <w:szCs w:val="17"/>
-              </w:rPr>
-              <w:t xml:space="preserve">–  electrical diagrams;</w:t>
-            </w:r>
-          </w:p>
-          <w:p>
-            <w:pPr>
-              <w:spacing w:after="20" w:line="252"/>
-              <w:ind w:left="360" w:hanging="200"/>
-            </w:pPr>
-            <w:r>
-              <w:rPr>
-                <w:rFonts w:ascii="Calibri" w:cs="Calibri" w:eastAsia="Microsoft YaHei" w:hAnsi="Calibri"/>
-                <w:sz w:val="17"/>
-                <w:szCs w:val="17"/>
-              </w:rPr>
-              <w:t xml:space="preserve">–  cable schedule;</w:t>
-            </w:r>
-          </w:p>
-          <w:p>
-            <w:pPr>
-              <w:spacing w:after="20" w:line="252"/>
-              <w:ind w:left="360" w:hanging="200"/>
-            </w:pPr>
-            <w:r>
-              <w:rPr>
-                <w:rFonts w:ascii="Calibri" w:cs="Calibri" w:eastAsia="Microsoft YaHei" w:hAnsi="Calibri"/>
-                <w:sz w:val="17"/>
-                <w:szCs w:val="17"/>
-              </w:rPr>
-              <w:t xml:space="preserve">–  earthing layout;</w:t>
-            </w:r>
-          </w:p>
-          <w:p>
-            <w:pPr>
-              <w:spacing w:after="20" w:line="252"/>
-              <w:ind w:left="360" w:hanging="200"/>
-            </w:pPr>
-            <w:r>
-              <w:rPr>
-                <w:rFonts w:ascii="Calibri" w:cs="Calibri" w:eastAsia="Microsoft YaHei" w:hAnsi="Calibri"/>
-                <w:sz w:val="17"/>
-                <w:szCs w:val="17"/>
-              </w:rPr>
-              <w:t xml:space="preserve">–  I/O list;</w:t>
-            </w:r>
-          </w:p>
-          <w:p>
-            <w:pPr>
-              <w:spacing w:after="20" w:line="252"/>
-              <w:ind w:left="360" w:hanging="200"/>
-            </w:pPr>
-            <w:r>
-              <w:rPr>
-                <w:rFonts w:ascii="Calibri" w:cs="Calibri" w:eastAsia="Microsoft YaHei" w:hAnsi="Calibri"/>
-                <w:sz w:val="17"/>
-                <w:szCs w:val="17"/>
-              </w:rPr>
-              <w:t xml:space="preserve">–  description of control algorithms and interlocks;</w:t>
-            </w:r>
-          </w:p>
-          <w:p>
-            <w:pPr>
-              <w:spacing w:after="20" w:line="252"/>
-              <w:ind w:left="360" w:hanging="200"/>
-            </w:pPr>
-            <w:r>
-              <w:rPr>
-                <w:rFonts w:ascii="Calibri" w:cs="Calibri" w:eastAsia="Microsoft YaHei" w:hAnsi="Calibri"/>
-                <w:sz w:val="17"/>
-                <w:szCs w:val="17"/>
-              </w:rPr>
-              <w:t xml:space="preserve">–  insulation resistance test report.</w:t>
+              <w:t xml:space="preserve">PLC and operator panel software (backup copy) (FAT programme, item 15).</w:t>
             </w:r>
           </w:p>
         </w:tc>
@@ -5012,7 +4844,7 @@
           </w:tcPr>
           <w:p>
             <w:pPr>
-              <w:spacing w:after="40" w:line="264"/>
+              <w:spacing w:after="0" w:line="264"/>
             </w:pPr>
             <w:r>
               <w:rPr>
@@ -5031,91 +4863,7 @@
                 <w:sz w:val="17"/>
                 <w:szCs w:val="17"/>
               </w:rPr>
-              <w:t xml:space="preserve">控制柜文件（FAT 大纲第 14 项）：</w:t>
-            </w:r>
-          </w:p>
-          <w:p>
-            <w:pPr>
-              <w:spacing w:after="20" w:line="252"/>
-              <w:ind w:left="360" w:hanging="200"/>
-            </w:pPr>
-            <w:r>
-              <w:rPr>
-                <w:rFonts w:ascii="Calibri" w:cs="Calibri" w:eastAsia="Microsoft YaHei" w:hAnsi="Calibri"/>
-                <w:sz w:val="17"/>
-                <w:szCs w:val="17"/>
-              </w:rPr>
-              <w:t xml:space="preserve">–  电气原理图；</w:t>
-            </w:r>
-          </w:p>
-          <w:p>
-            <w:pPr>
-              <w:spacing w:after="20" w:line="252"/>
-              <w:ind w:left="360" w:hanging="200"/>
-            </w:pPr>
-            <w:r>
-              <w:rPr>
-                <w:rFonts w:ascii="Calibri" w:cs="Calibri" w:eastAsia="Microsoft YaHei" w:hAnsi="Calibri"/>
-                <w:sz w:val="17"/>
-                <w:szCs w:val="17"/>
-              </w:rPr>
-              <w:t xml:space="preserve">–  电缆清册；</w:t>
-            </w:r>
-          </w:p>
-          <w:p>
-            <w:pPr>
-              <w:spacing w:after="20" w:line="252"/>
-              <w:ind w:left="360" w:hanging="200"/>
-            </w:pPr>
-            <w:r>
-              <w:rPr>
-                <w:rFonts w:ascii="Calibri" w:cs="Calibri" w:eastAsia="Microsoft YaHei" w:hAnsi="Calibri"/>
-                <w:sz w:val="17"/>
-                <w:szCs w:val="17"/>
-              </w:rPr>
-              <w:t xml:space="preserve">–  接地布置图；</w:t>
-            </w:r>
-          </w:p>
-          <w:p>
-            <w:pPr>
-              <w:spacing w:after="20" w:line="252"/>
-              <w:ind w:left="360" w:hanging="200"/>
-            </w:pPr>
-            <w:r>
-              <w:rPr>
-                <w:rFonts w:ascii="Calibri" w:cs="Calibri" w:eastAsia="Microsoft YaHei" w:hAnsi="Calibri"/>
-                <w:sz w:val="17"/>
-                <w:szCs w:val="17"/>
-              </w:rPr>
-              <w:t xml:space="preserve">–  输入/输出点表；</w:t>
-            </w:r>
-          </w:p>
-          <w:p>
-            <w:pPr>
-              <w:spacing w:after="20" w:line="252"/>
-              <w:ind w:left="360" w:hanging="200"/>
-            </w:pPr>
-            <w:r>
-              <w:rPr>
-                <w:rFonts w:ascii="Calibri" w:cs="Calibri" w:eastAsia="Microsoft YaHei" w:hAnsi="Calibri"/>
-                <w:sz w:val="17"/>
-                <w:szCs w:val="17"/>
-              </w:rPr>
-              <w:t xml:space="preserve">–  控制逻辑及联锁说明；</w:t>
-            </w:r>
-          </w:p>
-          <w:p>
-            <w:pPr>
-              <w:spacing w:after="20" w:line="252"/>
-              <w:ind w:left="360" w:hanging="200"/>
-            </w:pPr>
-            <w:r>
-              <w:rPr>
-                <w:rFonts w:ascii="Calibri" w:cs="Calibri" w:eastAsia="Microsoft YaHei" w:hAnsi="Calibri"/>
-                <w:sz w:val="17"/>
-                <w:szCs w:val="17"/>
-              </w:rPr>
-              <w:t xml:space="preserve">–  绝缘电阻测试报告。</w:t>
+              <w:t xml:space="preserve">PLC 及操作面板程序（备份）（FAT 大纲第 15 项）。</w:t>
             </w:r>
           </w:p>
         </w:tc>
@@ -5162,7 +4910,7 @@
                 <w:sz w:val="17"/>
                 <w:szCs w:val="17"/>
               </w:rPr>
-              <w:t xml:space="preserve">Программное обеспечение ПЛК и панели оператора (резервная копия) (п. 15 программы FAT).</w:t>
+              <w:t xml:space="preserve">Руководства IOM на установку в целом, испарители E-102/E-202, шестерённые насосы, чиллеры, шкаф управления (предъявлены только на вакуумные насосы) (п. 16 программы FAT).</w:t>
             </w:r>
           </w:p>
         </w:tc>
@@ -5204,7 +4952,7 @@
                 <w:sz w:val="17"/>
                 <w:szCs w:val="17"/>
               </w:rPr>
-              <w:t xml:space="preserve">PLC and operator panel software (backup copy) (FAT programme, item 15).</w:t>
+              <w:t xml:space="preserve">IOM manuals for the unit as a whole, evaporators E-102/E-202, gear pumps, chillers and control cabinet (presented for the vacuum pumps only) (FAT programme, item 16).</w:t>
             </w:r>
           </w:p>
         </w:tc>
@@ -5246,7 +4994,7 @@
                 <w:sz w:val="17"/>
                 <w:szCs w:val="17"/>
               </w:rPr>
-              <w:t xml:space="preserve">PLC 及操作面板程序（备份）（FAT 大纲第 15 项）。</w:t>
+              <w:t xml:space="preserve">整套装置、蒸发器 E-102/E-202、齿轮泵、冷水机、控制柜的安装、操作和维护手册（IOM）（仅提交了真空泵的手册）（FAT 大纲第 16 项）。</w:t>
             </w:r>
           </w:p>
         </w:tc>
@@ -5293,7 +5041,7 @@
                 <w:sz w:val="17"/>
                 <w:szCs w:val="17"/>
               </w:rPr>
-              <w:t xml:space="preserve">Руководства IOM на установку в целом, испарители E-102/E-202, шестерённые насосы, чиллеры, шкаф управления (предъявлены только на вакуумные насосы) (п. 16 программы FAT).</w:t>
+              <w:t xml:space="preserve">Высота крюка и масса ротора с приводом для выемки роторов E-102 и E-202 (п. 17 программы FAT).</w:t>
             </w:r>
           </w:p>
         </w:tc>
@@ -5335,7 +5083,7 @@
                 <w:sz w:val="17"/>
                 <w:szCs w:val="17"/>
               </w:rPr>
-              <w:t xml:space="preserve">IOM manuals for the unit as a whole, evaporators E-102/E-202, gear pumps, chillers and control cabinet (presented for the vacuum pumps only) (FAT programme, item 16).</w:t>
+              <w:t xml:space="preserve">Hook height and weight of the rotor with drive for removal of the E-102 and E-202 rotors (FAT programme, item 17).</w:t>
             </w:r>
           </w:p>
         </w:tc>
@@ -5377,7 +5125,7 @@
                 <w:sz w:val="17"/>
                 <w:szCs w:val="17"/>
               </w:rPr>
-              <w:t xml:space="preserve">整套装置、蒸发器 E-102/E-202、齿轮泵、冷水机、控制柜的安装、操作和维护手册（IOM）（仅提交了真空泵的手册）（FAT 大纲第 16 项）。</w:t>
+              <w:t xml:space="preserve">拆出 E-102 和 E-202 转子所需的吊钩高度及转子（含驱动）重量（FAT 大纲第 17 项）。</w:t>
             </w:r>
           </w:p>
         </w:tc>
@@ -5424,7 +5172,7 @@
                 <w:sz w:val="17"/>
                 <w:szCs w:val="17"/>
               </w:rPr>
-              <w:t xml:space="preserve">Высота крюка и масса ротора с приводом для выемки роторов E-102 и E-202 (п. 17 программы FAT).</w:t>
+              <w:t xml:space="preserve">Схема разделения на транспортные места с габаритами и массами (п. 18 программы FAT).</w:t>
             </w:r>
           </w:p>
         </w:tc>
@@ -5466,7 +5214,7 @@
                 <w:sz w:val="17"/>
                 <w:szCs w:val="17"/>
               </w:rPr>
-              <w:t xml:space="preserve">Hook height and weight of the rotor with drive for removal of the E-102 and E-202 rotors (FAT programme, item 17).</w:t>
+              <w:t xml:space="preserve">Shipping split diagram with dimensions and weights (FAT programme, item 18).</w:t>
             </w:r>
           </w:p>
         </w:tc>
@@ -5508,7 +5256,7 @@
                 <w:sz w:val="17"/>
                 <w:szCs w:val="17"/>
               </w:rPr>
-              <w:t xml:space="preserve">拆出 E-102 和 E-202 转子所需的吊钩高度及转子（含驱动）重量（FAT 大纲第 17 项）。</w:t>
+              <w:t xml:space="preserve">运输分包方案图（含外形尺寸和重量）（FAT 大纲第 18 项）。</w:t>
             </w:r>
           </w:p>
         </w:tc>
@@ -5555,7 +5303,7 @@
                 <w:sz w:val="17"/>
                 <w:szCs w:val="17"/>
               </w:rPr>
-              <w:t xml:space="preserve">Схема разделения на транспортные места с габаритами и массами (п. 18 программы FAT).</w:t>
+              <w:t xml:space="preserve">Протоколы балансировки роторов E-102 и E-202 (G 6.3) (разд. 9, п. 5 программы FAT).</w:t>
             </w:r>
           </w:p>
         </w:tc>
@@ -5597,7 +5345,7 @@
                 <w:sz w:val="17"/>
                 <w:szCs w:val="17"/>
               </w:rPr>
-              <w:t xml:space="preserve">Shipping split diagram with dimensions and weights (FAT programme, item 18).</w:t>
+              <w:t xml:space="preserve">Balancing reports for the E-102 and E-202 rotors (G 6.3) (FAT programme, section 9, item 5).</w:t>
             </w:r>
           </w:p>
         </w:tc>
@@ -5632,137 +5380,6 @@
                 <w:szCs w:val="17"/>
               </w:rPr>
               <w:t xml:space="preserve">1.20  </w:t>
-            </w:r>
-            <w:r>
-              <w:rPr>
-                <w:rFonts w:ascii="Calibri" w:cs="Calibri" w:eastAsia="Microsoft YaHei" w:hAnsi="Calibri"/>
-                <w:sz w:val="17"/>
-                <w:szCs w:val="17"/>
-              </w:rPr>
-              <w:t xml:space="preserve">运输分包方案图（含外形尺寸和重量）（FAT 大纲第 18 项）。</w:t>
-            </w:r>
-          </w:p>
-        </w:tc>
-      </w:tr>
-      <w:tr>
-        <w:trPr>
-          <w:cantSplit/>
-        </w:trPr>
-        <w:tc>
-          <w:tcPr>
-            <w:tcW w:type="dxa" w:w="5084"/>
-            <w:tcBorders>
-              <w:top w:val="none" w:color="FFFFFF" w:sz="0"/>
-              <w:left w:val="none" w:color="FFFFFF" w:sz="0"/>
-              <w:bottom w:val="single" w:color="C9D3E0" w:sz="2"/>
-              <w:right w:val="single" w:color="C9D3E0" w:sz="2"/>
-            </w:tcBorders>
-            <w:tcMar>
-              <w:top w:type="dxa" w:w="80"/>
-              <w:left w:type="dxa" w:w="120"/>
-              <w:bottom w:type="dxa" w:w="80"/>
-              <w:right w:type="dxa" w:w="120"/>
-            </w:tcMar>
-            <w:vAlign w:val="top"/>
-          </w:tcPr>
-          <w:p>
-            <w:pPr>
-              <w:spacing w:after="0" w:line="264"/>
-            </w:pPr>
-            <w:r>
-              <w:rPr>
-                <w:rFonts w:ascii="Calibri" w:cs="Calibri" w:eastAsia="Microsoft YaHei" w:hAnsi="Calibri"/>
-                <w:b/>
-                <w:bCs/>
-                <w:color w:val="B4541A"/>
-                <w:sz w:val="17"/>
-                <w:szCs w:val="17"/>
-              </w:rPr>
-              <w:t xml:space="preserve">1.21  </w:t>
-            </w:r>
-            <w:r>
-              <w:rPr>
-                <w:rFonts w:ascii="Calibri" w:cs="Calibri" w:eastAsia="Microsoft YaHei" w:hAnsi="Calibri"/>
-                <w:sz w:val="17"/>
-                <w:szCs w:val="17"/>
-              </w:rPr>
-              <w:t xml:space="preserve">Протоколы балансировки роторов E-102 и E-202 (G 6.3) (разд. 9, п. 5 программы FAT).</w:t>
-            </w:r>
-          </w:p>
-        </w:tc>
-        <w:tc>
-          <w:tcPr>
-            <w:tcW w:type="dxa" w:w="5084"/>
-            <w:tcBorders>
-              <w:top w:val="none" w:color="FFFFFF" w:sz="0"/>
-              <w:left w:val="none" w:color="FFFFFF" w:sz="0"/>
-              <w:bottom w:val="single" w:color="C9D3E0" w:sz="2"/>
-              <w:right w:val="single" w:color="C9D3E0" w:sz="2"/>
-            </w:tcBorders>
-            <w:tcMar>
-              <w:top w:type="dxa" w:w="80"/>
-              <w:left w:type="dxa" w:w="120"/>
-              <w:bottom w:type="dxa" w:w="80"/>
-              <w:right w:type="dxa" w:w="120"/>
-            </w:tcMar>
-            <w:vAlign w:val="top"/>
-          </w:tcPr>
-          <w:p>
-            <w:pPr>
-              <w:spacing w:after="0" w:line="264"/>
-            </w:pPr>
-            <w:r>
-              <w:rPr>
-                <w:rFonts w:ascii="Calibri" w:cs="Calibri" w:eastAsia="Microsoft YaHei" w:hAnsi="Calibri"/>
-                <w:b/>
-                <w:bCs/>
-                <w:color w:val="B4541A"/>
-                <w:sz w:val="17"/>
-                <w:szCs w:val="17"/>
-              </w:rPr>
-              <w:t xml:space="preserve">1.21  </w:t>
-            </w:r>
-            <w:r>
-              <w:rPr>
-                <w:rFonts w:ascii="Calibri" w:cs="Calibri" w:eastAsia="Microsoft YaHei" w:hAnsi="Calibri"/>
-                <w:sz w:val="17"/>
-                <w:szCs w:val="17"/>
-              </w:rPr>
-              <w:t xml:space="preserve">Balancing reports for the E-102 and E-202 rotors (G 6.3) (FAT programme, section 9, item 5).</w:t>
-            </w:r>
-          </w:p>
-        </w:tc>
-        <w:tc>
-          <w:tcPr>
-            <w:tcW w:type="dxa" w:w="5084"/>
-            <w:tcBorders>
-              <w:top w:val="none" w:color="FFFFFF" w:sz="0"/>
-              <w:left w:val="none" w:color="FFFFFF" w:sz="0"/>
-              <w:bottom w:val="single" w:color="C9D3E0" w:sz="2"/>
-              <w:right w:val="none" w:color="FFFFFF" w:sz="0"/>
-            </w:tcBorders>
-            <w:tcMar>
-              <w:top w:type="dxa" w:w="80"/>
-              <w:left w:type="dxa" w:w="120"/>
-              <w:bottom w:type="dxa" w:w="80"/>
-              <w:right w:type="dxa" w:w="120"/>
-            </w:tcMar>
-            <w:vAlign w:val="top"/>
-          </w:tcPr>
-          <w:p>
-            <w:pPr>
-              <w:spacing w:after="0" w:line="264"/>
-            </w:pPr>
-            <w:r>
-              <w:rPr>
-                <w:rFonts w:ascii="Calibri" w:cs="Calibri" w:eastAsia="Microsoft YaHei" w:hAnsi="Calibri"/>
-                <w:b/>
-                <w:bCs/>
-                <w:color w:val="B4541A"/>
-                <w:sz w:val="17"/>
-                <w:szCs w:val="17"/>
-              </w:rPr>
-              <w:t xml:space="preserve">1.21  </w:t>
             </w:r>
             <w:r>
               <w:rPr>

</xml_diff>

<commit_message>
Acceptance test report: remove PLC software backup item
Co-Authored-By: Claude Opus 5.5 <noreply@anthropic.com>
Claude-Session: https://claude.ai/code/session_01DhfrxujFdtSZWrLQm5rNqB
</commit_message>
<xml_diff>
--- a/Акт_приемочных_испытаний_RU-EN-CN.docx
+++ b/Акт_приемочных_испытаний_RU-EN-CN.docx
@@ -1460,7 +1460,7 @@
                 <w:sz w:val="17"/>
                 <w:szCs w:val="17"/>
               </w:rPr>
-              <w:t xml:space="preserve">62</w:t>
+              <w:t xml:space="preserve">61</w:t>
             </w:r>
           </w:p>
         </w:tc>
@@ -1538,7 +1538,7 @@
                 <w:sz w:val="17"/>
                 <w:szCs w:val="17"/>
               </w:rPr>
-              <w:t xml:space="preserve">62</w:t>
+              <w:t xml:space="preserve">61</w:t>
             </w:r>
           </w:p>
         </w:tc>
@@ -1870,7 +1870,7 @@
                 <w:sz w:val="16"/>
                 <w:szCs w:val="16"/>
               </w:rPr>
-              <w:t xml:space="preserve">20</w:t>
+              <w:t xml:space="preserve">19</w:t>
             </w:r>
           </w:p>
           <w:p>
@@ -1887,7 +1887,7 @@
                 <w:sz w:val="16"/>
                 <w:szCs w:val="16"/>
               </w:rPr>
-              <w:t xml:space="preserve">Пункты 1.6–1.20 — документы раздела 1 программы FAT, не вошедшие в комплект, предъявленный Продавцом.</w:t>
+              <w:t xml:space="preserve">Пункты 1.6–1.19 — документы раздела 1 программы FAT, не вошедшие в комплект, предъявленный Продавцом.</w:t>
             </w:r>
           </w:p>
         </w:tc>
@@ -1932,7 +1932,7 @@
                 <w:sz w:val="16"/>
                 <w:szCs w:val="16"/>
               </w:rPr>
-              <w:t xml:space="preserve">20</w:t>
+              <w:t xml:space="preserve">19</w:t>
             </w:r>
           </w:p>
           <w:p>
@@ -1949,7 +1949,7 @@
                 <w:sz w:val="16"/>
                 <w:szCs w:val="16"/>
               </w:rPr>
-              <w:t xml:space="preserve">Items 1.6–1.20 are documents under section 1 of the FAT programme not included in the set presented by the Seller.</w:t>
+              <w:t xml:space="preserve">Items 1.6–1.19 are documents under section 1 of the FAT programme not included in the set presented by the Seller.</w:t>
             </w:r>
           </w:p>
         </w:tc>
@@ -1994,7 +1994,7 @@
                 <w:sz w:val="16"/>
                 <w:szCs w:val="16"/>
               </w:rPr>
-              <w:t xml:space="preserve">20</w:t>
+              <w:t xml:space="preserve">19</w:t>
             </w:r>
           </w:p>
           <w:p>
@@ -2011,7 +2011,7 @@
                 <w:sz w:val="16"/>
                 <w:szCs w:val="16"/>
               </w:rPr>
-              <w:t xml:space="preserve">第 1.6–1.20 项为 FAT 大纲第 1 章所列、卖方提交文件中缺少的文件。</w:t>
+              <w:t xml:space="preserve">第 1.6–1.19 项为 FAT 大纲第 1 章所列、卖方提交文件中缺少的文件。</w:t>
             </w:r>
           </w:p>
         </w:tc>
@@ -4779,7 +4779,7 @@
                 <w:sz w:val="17"/>
                 <w:szCs w:val="17"/>
               </w:rPr>
-              <w:t xml:space="preserve">Программное обеспечение ПЛК и панели оператора (резервная копия) (п. 15 программы FAT).</w:t>
+              <w:t xml:space="preserve">Руководства IOM на установку в целом, испарители E-102/E-202, шестерённые насосы, чиллеры, шкаф управления (предъявлены только на вакуумные насосы) (п. 16 программы FAT).</w:t>
             </w:r>
           </w:p>
         </w:tc>
@@ -4821,7 +4821,7 @@
                 <w:sz w:val="17"/>
                 <w:szCs w:val="17"/>
               </w:rPr>
-              <w:t xml:space="preserve">PLC and operator panel software (backup copy) (FAT programme, item 15).</w:t>
+              <w:t xml:space="preserve">IOM manuals for the unit as a whole, evaporators E-102/E-202, gear pumps, chillers and control cabinet (presented for the vacuum pumps only) (FAT programme, item 16).</w:t>
             </w:r>
           </w:p>
         </w:tc>
@@ -4863,7 +4863,7 @@
                 <w:sz w:val="17"/>
                 <w:szCs w:val="17"/>
               </w:rPr>
-              <w:t xml:space="preserve">PLC 及操作面板程序（备份）（FAT 大纲第 15 项）。</w:t>
+              <w:t xml:space="preserve">整套装置、蒸发器 E-102/E-202、齿轮泵、冷水机、控制柜的安装、操作和维护手册（IOM）（仅提交了真空泵的手册）（FAT 大纲第 16 项）。</w:t>
             </w:r>
           </w:p>
         </w:tc>
@@ -4910,7 +4910,7 @@
                 <w:sz w:val="17"/>
                 <w:szCs w:val="17"/>
               </w:rPr>
-              <w:t xml:space="preserve">Руководства IOM на установку в целом, испарители E-102/E-202, шестерённые насосы, чиллеры, шкаф управления (предъявлены только на вакуумные насосы) (п. 16 программы FAT).</w:t>
+              <w:t xml:space="preserve">Высота крюка и масса ротора с приводом для выемки роторов E-102 и E-202 (п. 17 программы FAT).</w:t>
             </w:r>
           </w:p>
         </w:tc>
@@ -4952,7 +4952,7 @@
                 <w:sz w:val="17"/>
                 <w:szCs w:val="17"/>
               </w:rPr>
-              <w:t xml:space="preserve">IOM manuals for the unit as a whole, evaporators E-102/E-202, gear pumps, chillers and control cabinet (presented for the vacuum pumps only) (FAT programme, item 16).</w:t>
+              <w:t xml:space="preserve">Hook height and weight of the rotor with drive for removal of the E-102 and E-202 rotors (FAT programme, item 17).</w:t>
             </w:r>
           </w:p>
         </w:tc>
@@ -4994,7 +4994,7 @@
                 <w:sz w:val="17"/>
                 <w:szCs w:val="17"/>
               </w:rPr>
-              <w:t xml:space="preserve">整套装置、蒸发器 E-102/E-202、齿轮泵、冷水机、控制柜的安装、操作和维护手册（IOM）（仅提交了真空泵的手册）（FAT 大纲第 16 项）。</w:t>
+              <w:t xml:space="preserve">拆出 E-102 和 E-202 转子所需的吊钩高度及转子（含驱动）重量（FAT 大纲第 17 项）。</w:t>
             </w:r>
           </w:p>
         </w:tc>
@@ -5041,7 +5041,7 @@
                 <w:sz w:val="17"/>
                 <w:szCs w:val="17"/>
               </w:rPr>
-              <w:t xml:space="preserve">Высота крюка и масса ротора с приводом для выемки роторов E-102 и E-202 (п. 17 программы FAT).</w:t>
+              <w:t xml:space="preserve">Схема разделения на транспортные места с габаритами и массами (п. 18 программы FAT).</w:t>
             </w:r>
           </w:p>
         </w:tc>
@@ -5083,7 +5083,7 @@
                 <w:sz w:val="17"/>
                 <w:szCs w:val="17"/>
               </w:rPr>
-              <w:t xml:space="preserve">Hook height and weight of the rotor with drive for removal of the E-102 and E-202 rotors (FAT programme, item 17).</w:t>
+              <w:t xml:space="preserve">Shipping split diagram with dimensions and weights (FAT programme, item 18).</w:t>
             </w:r>
           </w:p>
         </w:tc>
@@ -5125,7 +5125,7 @@
                 <w:sz w:val="17"/>
                 <w:szCs w:val="17"/>
               </w:rPr>
-              <w:t xml:space="preserve">拆出 E-102 和 E-202 转子所需的吊钩高度及转子（含驱动）重量（FAT 大纲第 17 项）。</w:t>
+              <w:t xml:space="preserve">运输分包方案图（含外形尺寸和重量）（FAT 大纲第 18 项）。</w:t>
             </w:r>
           </w:p>
         </w:tc>
@@ -5172,7 +5172,7 @@
                 <w:sz w:val="17"/>
                 <w:szCs w:val="17"/>
               </w:rPr>
-              <w:t xml:space="preserve">Схема разделения на транспортные места с габаритами и массами (п. 18 программы FAT).</w:t>
+              <w:t xml:space="preserve">Протоколы балансировки роторов E-102 и E-202 (G 6.3) (разд. 9, п. 5 программы FAT).</w:t>
             </w:r>
           </w:p>
         </w:tc>
@@ -5214,7 +5214,7 @@
                 <w:sz w:val="17"/>
                 <w:szCs w:val="17"/>
               </w:rPr>
-              <w:t xml:space="preserve">Shipping split diagram with dimensions and weights (FAT programme, item 18).</w:t>
+              <w:t xml:space="preserve">Balancing reports for the E-102 and E-202 rotors (G 6.3) (FAT programme, section 9, item 5).</w:t>
             </w:r>
           </w:p>
         </w:tc>
@@ -5249,137 +5249,6 @@
                 <w:szCs w:val="17"/>
               </w:rPr>
               <w:t xml:space="preserve">1.19  </w:t>
-            </w:r>
-            <w:r>
-              <w:rPr>
-                <w:rFonts w:ascii="Calibri" w:cs="Calibri" w:eastAsia="Microsoft YaHei" w:hAnsi="Calibri"/>
-                <w:sz w:val="17"/>
-                <w:szCs w:val="17"/>
-              </w:rPr>
-              <w:t xml:space="preserve">运输分包方案图（含外形尺寸和重量）（FAT 大纲第 18 项）。</w:t>
-            </w:r>
-          </w:p>
-        </w:tc>
-      </w:tr>
-      <w:tr>
-        <w:trPr>
-          <w:cantSplit/>
-        </w:trPr>
-        <w:tc>
-          <w:tcPr>
-            <w:tcW w:type="dxa" w:w="5084"/>
-            <w:tcBorders>
-              <w:top w:val="none" w:color="FFFFFF" w:sz="0"/>
-              <w:left w:val="none" w:color="FFFFFF" w:sz="0"/>
-              <w:bottom w:val="single" w:color="C9D3E0" w:sz="2"/>
-              <w:right w:val="single" w:color="C9D3E0" w:sz="2"/>
-            </w:tcBorders>
-            <w:tcMar>
-              <w:top w:type="dxa" w:w="80"/>
-              <w:left w:type="dxa" w:w="120"/>
-              <w:bottom w:type="dxa" w:w="80"/>
-              <w:right w:type="dxa" w:w="120"/>
-            </w:tcMar>
-            <w:vAlign w:val="top"/>
-          </w:tcPr>
-          <w:p>
-            <w:pPr>
-              <w:spacing w:after="0" w:line="264"/>
-            </w:pPr>
-            <w:r>
-              <w:rPr>
-                <w:rFonts w:ascii="Calibri" w:cs="Calibri" w:eastAsia="Microsoft YaHei" w:hAnsi="Calibri"/>
-                <w:b/>
-                <w:bCs/>
-                <w:color w:val="B4541A"/>
-                <w:sz w:val="17"/>
-                <w:szCs w:val="17"/>
-              </w:rPr>
-              <w:t xml:space="preserve">1.20  </w:t>
-            </w:r>
-            <w:r>
-              <w:rPr>
-                <w:rFonts w:ascii="Calibri" w:cs="Calibri" w:eastAsia="Microsoft YaHei" w:hAnsi="Calibri"/>
-                <w:sz w:val="17"/>
-                <w:szCs w:val="17"/>
-              </w:rPr>
-              <w:t xml:space="preserve">Протоколы балансировки роторов E-102 и E-202 (G 6.3) (разд. 9, п. 5 программы FAT).</w:t>
-            </w:r>
-          </w:p>
-        </w:tc>
-        <w:tc>
-          <w:tcPr>
-            <w:tcW w:type="dxa" w:w="5084"/>
-            <w:tcBorders>
-              <w:top w:val="none" w:color="FFFFFF" w:sz="0"/>
-              <w:left w:val="none" w:color="FFFFFF" w:sz="0"/>
-              <w:bottom w:val="single" w:color="C9D3E0" w:sz="2"/>
-              <w:right w:val="single" w:color="C9D3E0" w:sz="2"/>
-            </w:tcBorders>
-            <w:tcMar>
-              <w:top w:type="dxa" w:w="80"/>
-              <w:left w:type="dxa" w:w="120"/>
-              <w:bottom w:type="dxa" w:w="80"/>
-              <w:right w:type="dxa" w:w="120"/>
-            </w:tcMar>
-            <w:vAlign w:val="top"/>
-          </w:tcPr>
-          <w:p>
-            <w:pPr>
-              <w:spacing w:after="0" w:line="264"/>
-            </w:pPr>
-            <w:r>
-              <w:rPr>
-                <w:rFonts w:ascii="Calibri" w:cs="Calibri" w:eastAsia="Microsoft YaHei" w:hAnsi="Calibri"/>
-                <w:b/>
-                <w:bCs/>
-                <w:color w:val="B4541A"/>
-                <w:sz w:val="17"/>
-                <w:szCs w:val="17"/>
-              </w:rPr>
-              <w:t xml:space="preserve">1.20  </w:t>
-            </w:r>
-            <w:r>
-              <w:rPr>
-                <w:rFonts w:ascii="Calibri" w:cs="Calibri" w:eastAsia="Microsoft YaHei" w:hAnsi="Calibri"/>
-                <w:sz w:val="17"/>
-                <w:szCs w:val="17"/>
-              </w:rPr>
-              <w:t xml:space="preserve">Balancing reports for the E-102 and E-202 rotors (G 6.3) (FAT programme, section 9, item 5).</w:t>
-            </w:r>
-          </w:p>
-        </w:tc>
-        <w:tc>
-          <w:tcPr>
-            <w:tcW w:type="dxa" w:w="5084"/>
-            <w:tcBorders>
-              <w:top w:val="none" w:color="FFFFFF" w:sz="0"/>
-              <w:left w:val="none" w:color="FFFFFF" w:sz="0"/>
-              <w:bottom w:val="single" w:color="C9D3E0" w:sz="2"/>
-              <w:right w:val="none" w:color="FFFFFF" w:sz="0"/>
-            </w:tcBorders>
-            <w:tcMar>
-              <w:top w:type="dxa" w:w="80"/>
-              <w:left w:type="dxa" w:w="120"/>
-              <w:bottom w:type="dxa" w:w="80"/>
-              <w:right w:type="dxa" w:w="120"/>
-            </w:tcMar>
-            <w:vAlign w:val="top"/>
-          </w:tcPr>
-          <w:p>
-            <w:pPr>
-              <w:spacing w:after="0" w:line="264"/>
-            </w:pPr>
-            <w:r>
-              <w:rPr>
-                <w:rFonts w:ascii="Calibri" w:cs="Calibri" w:eastAsia="Microsoft YaHei" w:hAnsi="Calibri"/>
-                <w:b/>
-                <w:bCs/>
-                <w:color w:val="B4541A"/>
-                <w:sz w:val="17"/>
-                <w:szCs w:val="17"/>
-              </w:rPr>
-              <w:t xml:space="preserve">1.20  </w:t>
             </w:r>
             <w:r>
               <w:rPr>

</xml_diff>

<commit_message>
Acceptance test report: remove hook height and rotor mass item
Co-Authored-By: Claude Opus 5.5 <noreply@anthropic.com>
Claude-Session: https://claude.ai/code/session_01DhfrxujFdtSZWrLQm5rNqB
</commit_message>
<xml_diff>
--- a/Акт_приемочных_испытаний_RU-EN-CN.docx
+++ b/Акт_приемочных_испытаний_RU-EN-CN.docx
@@ -1460,7 +1460,7 @@
                 <w:sz w:val="17"/>
                 <w:szCs w:val="17"/>
               </w:rPr>
-              <w:t xml:space="preserve">61</w:t>
+              <w:t xml:space="preserve">60</w:t>
             </w:r>
           </w:p>
         </w:tc>
@@ -1538,7 +1538,7 @@
                 <w:sz w:val="17"/>
                 <w:szCs w:val="17"/>
               </w:rPr>
-              <w:t xml:space="preserve">61</w:t>
+              <w:t xml:space="preserve">60</w:t>
             </w:r>
           </w:p>
         </w:tc>
@@ -1870,7 +1870,7 @@
                 <w:sz w:val="16"/>
                 <w:szCs w:val="16"/>
               </w:rPr>
-              <w:t xml:space="preserve">19</w:t>
+              <w:t xml:space="preserve">18</w:t>
             </w:r>
           </w:p>
           <w:p>
@@ -1887,7 +1887,7 @@
                 <w:sz w:val="16"/>
                 <w:szCs w:val="16"/>
               </w:rPr>
-              <w:t xml:space="preserve">Пункты 1.6–1.19 — документы раздела 1 программы FAT, не вошедшие в комплект, предъявленный Продавцом.</w:t>
+              <w:t xml:space="preserve">Пункты 1.6–1.18 — документы раздела 1 программы FAT, не вошедшие в комплект, предъявленный Продавцом.</w:t>
             </w:r>
           </w:p>
         </w:tc>
@@ -1932,7 +1932,7 @@
                 <w:sz w:val="16"/>
                 <w:szCs w:val="16"/>
               </w:rPr>
-              <w:t xml:space="preserve">19</w:t>
+              <w:t xml:space="preserve">18</w:t>
             </w:r>
           </w:p>
           <w:p>
@@ -1949,7 +1949,7 @@
                 <w:sz w:val="16"/>
                 <w:szCs w:val="16"/>
               </w:rPr>
-              <w:t xml:space="preserve">Items 1.6–1.19 are documents under section 1 of the FAT programme not included in the set presented by the Seller.</w:t>
+              <w:t xml:space="preserve">Items 1.6–1.18 are documents under section 1 of the FAT programme not included in the set presented by the Seller.</w:t>
             </w:r>
           </w:p>
         </w:tc>
@@ -1994,7 +1994,7 @@
                 <w:sz w:val="16"/>
                 <w:szCs w:val="16"/>
               </w:rPr>
-              <w:t xml:space="preserve">19</w:t>
+              <w:t xml:space="preserve">18</w:t>
             </w:r>
           </w:p>
           <w:p>
@@ -2011,7 +2011,7 @@
                 <w:sz w:val="16"/>
                 <w:szCs w:val="16"/>
               </w:rPr>
-              <w:t xml:space="preserve">第 1.6–1.19 项为 FAT 大纲第 1 章所列、卖方提交文件中缺少的文件。</w:t>
+              <w:t xml:space="preserve">第 1.6–1.18 项为 FAT 大纲第 1 章所列、卖方提交文件中缺少的文件。</w:t>
             </w:r>
           </w:p>
         </w:tc>
@@ -4910,7 +4910,7 @@
                 <w:sz w:val="17"/>
                 <w:szCs w:val="17"/>
               </w:rPr>
-              <w:t xml:space="preserve">Высота крюка и масса ротора с приводом для выемки роторов E-102 и E-202 (п. 17 программы FAT).</w:t>
+              <w:t xml:space="preserve">Схема разделения на транспортные места с габаритами и массами (п. 18 программы FAT).</w:t>
             </w:r>
           </w:p>
         </w:tc>
@@ -4952,7 +4952,7 @@
                 <w:sz w:val="17"/>
                 <w:szCs w:val="17"/>
               </w:rPr>
-              <w:t xml:space="preserve">Hook height and weight of the rotor with drive for removal of the E-102 and E-202 rotors (FAT programme, item 17).</w:t>
+              <w:t xml:space="preserve">Shipping split diagram with dimensions and weights (FAT programme, item 18).</w:t>
             </w:r>
           </w:p>
         </w:tc>
@@ -4994,7 +4994,7 @@
                 <w:sz w:val="17"/>
                 <w:szCs w:val="17"/>
               </w:rPr>
-              <w:t xml:space="preserve">拆出 E-102 和 E-202 转子所需的吊钩高度及转子（含驱动）重量（FAT 大纲第 17 项）。</w:t>
+              <w:t xml:space="preserve">运输分包方案图（含外形尺寸和重量）（FAT 大纲第 18 项）。</w:t>
             </w:r>
           </w:p>
         </w:tc>
@@ -5041,7 +5041,7 @@
                 <w:sz w:val="17"/>
                 <w:szCs w:val="17"/>
               </w:rPr>
-              <w:t xml:space="preserve">Схема разделения на транспортные места с габаритами и массами (п. 18 программы FAT).</w:t>
+              <w:t xml:space="preserve">Протоколы балансировки роторов E-102 и E-202 (G 6.3) (разд. 9, п. 5 программы FAT).</w:t>
             </w:r>
           </w:p>
         </w:tc>
@@ -5083,7 +5083,7 @@
                 <w:sz w:val="17"/>
                 <w:szCs w:val="17"/>
               </w:rPr>
-              <w:t xml:space="preserve">Shipping split diagram with dimensions and weights (FAT programme, item 18).</w:t>
+              <w:t xml:space="preserve">Balancing reports for the E-102 and E-202 rotors (G 6.3) (FAT programme, section 9, item 5).</w:t>
             </w:r>
           </w:p>
         </w:tc>
@@ -5118,137 +5118,6 @@
                 <w:szCs w:val="17"/>
               </w:rPr>
               <w:t xml:space="preserve">1.18  </w:t>
-            </w:r>
-            <w:r>
-              <w:rPr>
-                <w:rFonts w:ascii="Calibri" w:cs="Calibri" w:eastAsia="Microsoft YaHei" w:hAnsi="Calibri"/>
-                <w:sz w:val="17"/>
-                <w:szCs w:val="17"/>
-              </w:rPr>
-              <w:t xml:space="preserve">运输分包方案图（含外形尺寸和重量）（FAT 大纲第 18 项）。</w:t>
-            </w:r>
-          </w:p>
-        </w:tc>
-      </w:tr>
-      <w:tr>
-        <w:trPr>
-          <w:cantSplit/>
-        </w:trPr>
-        <w:tc>
-          <w:tcPr>
-            <w:tcW w:type="dxa" w:w="5084"/>
-            <w:tcBorders>
-              <w:top w:val="none" w:color="FFFFFF" w:sz="0"/>
-              <w:left w:val="none" w:color="FFFFFF" w:sz="0"/>
-              <w:bottom w:val="single" w:color="C9D3E0" w:sz="2"/>
-              <w:right w:val="single" w:color="C9D3E0" w:sz="2"/>
-            </w:tcBorders>
-            <w:tcMar>
-              <w:top w:type="dxa" w:w="80"/>
-              <w:left w:type="dxa" w:w="120"/>
-              <w:bottom w:type="dxa" w:w="80"/>
-              <w:right w:type="dxa" w:w="120"/>
-            </w:tcMar>
-            <w:vAlign w:val="top"/>
-          </w:tcPr>
-          <w:p>
-            <w:pPr>
-              <w:spacing w:after="0" w:line="264"/>
-            </w:pPr>
-            <w:r>
-              <w:rPr>
-                <w:rFonts w:ascii="Calibri" w:cs="Calibri" w:eastAsia="Microsoft YaHei" w:hAnsi="Calibri"/>
-                <w:b/>
-                <w:bCs/>
-                <w:color w:val="B4541A"/>
-                <w:sz w:val="17"/>
-                <w:szCs w:val="17"/>
-              </w:rPr>
-              <w:t xml:space="preserve">1.19  </w:t>
-            </w:r>
-            <w:r>
-              <w:rPr>
-                <w:rFonts w:ascii="Calibri" w:cs="Calibri" w:eastAsia="Microsoft YaHei" w:hAnsi="Calibri"/>
-                <w:sz w:val="17"/>
-                <w:szCs w:val="17"/>
-              </w:rPr>
-              <w:t xml:space="preserve">Протоколы балансировки роторов E-102 и E-202 (G 6.3) (разд. 9, п. 5 программы FAT).</w:t>
-            </w:r>
-          </w:p>
-        </w:tc>
-        <w:tc>
-          <w:tcPr>
-            <w:tcW w:type="dxa" w:w="5084"/>
-            <w:tcBorders>
-              <w:top w:val="none" w:color="FFFFFF" w:sz="0"/>
-              <w:left w:val="none" w:color="FFFFFF" w:sz="0"/>
-              <w:bottom w:val="single" w:color="C9D3E0" w:sz="2"/>
-              <w:right w:val="single" w:color="C9D3E0" w:sz="2"/>
-            </w:tcBorders>
-            <w:tcMar>
-              <w:top w:type="dxa" w:w="80"/>
-              <w:left w:type="dxa" w:w="120"/>
-              <w:bottom w:type="dxa" w:w="80"/>
-              <w:right w:type="dxa" w:w="120"/>
-            </w:tcMar>
-            <w:vAlign w:val="top"/>
-          </w:tcPr>
-          <w:p>
-            <w:pPr>
-              <w:spacing w:after="0" w:line="264"/>
-            </w:pPr>
-            <w:r>
-              <w:rPr>
-                <w:rFonts w:ascii="Calibri" w:cs="Calibri" w:eastAsia="Microsoft YaHei" w:hAnsi="Calibri"/>
-                <w:b/>
-                <w:bCs/>
-                <w:color w:val="B4541A"/>
-                <w:sz w:val="17"/>
-                <w:szCs w:val="17"/>
-              </w:rPr>
-              <w:t xml:space="preserve">1.19  </w:t>
-            </w:r>
-            <w:r>
-              <w:rPr>
-                <w:rFonts w:ascii="Calibri" w:cs="Calibri" w:eastAsia="Microsoft YaHei" w:hAnsi="Calibri"/>
-                <w:sz w:val="17"/>
-                <w:szCs w:val="17"/>
-              </w:rPr>
-              <w:t xml:space="preserve">Balancing reports for the E-102 and E-202 rotors (G 6.3) (FAT programme, section 9, item 5).</w:t>
-            </w:r>
-          </w:p>
-        </w:tc>
-        <w:tc>
-          <w:tcPr>
-            <w:tcW w:type="dxa" w:w="5084"/>
-            <w:tcBorders>
-              <w:top w:val="none" w:color="FFFFFF" w:sz="0"/>
-              <w:left w:val="none" w:color="FFFFFF" w:sz="0"/>
-              <w:bottom w:val="single" w:color="C9D3E0" w:sz="2"/>
-              <w:right w:val="none" w:color="FFFFFF" w:sz="0"/>
-            </w:tcBorders>
-            <w:tcMar>
-              <w:top w:type="dxa" w:w="80"/>
-              <w:left w:type="dxa" w:w="120"/>
-              <w:bottom w:type="dxa" w:w="80"/>
-              <w:right w:type="dxa" w:w="120"/>
-            </w:tcMar>
-            <w:vAlign w:val="top"/>
-          </w:tcPr>
-          <w:p>
-            <w:pPr>
-              <w:spacing w:after="0" w:line="264"/>
-            </w:pPr>
-            <w:r>
-              <w:rPr>
-                <w:rFonts w:ascii="Calibri" w:cs="Calibri" w:eastAsia="Microsoft YaHei" w:hAnsi="Calibri"/>
-                <w:b/>
-                <w:bCs/>
-                <w:color w:val="B4541A"/>
-                <w:sz w:val="17"/>
-                <w:szCs w:val="17"/>
-              </w:rPr>
-              <w:t xml:space="preserve">1.19  </w:t>
             </w:r>
             <w:r>
               <w:rPr>

</xml_diff>

<commit_message>
Acceptance test report: remove rotor balancing reports item
Co-Authored-By: Claude Opus 5.5 <noreply@anthropic.com>
Claude-Session: https://claude.ai/code/session_01DhfrxujFdtSZWrLQm5rNqB
</commit_message>
<xml_diff>
--- a/Акт_приемочных_испытаний_RU-EN-CN.docx
+++ b/Акт_приемочных_испытаний_RU-EN-CN.docx
@@ -1460,7 +1460,7 @@
                 <w:sz w:val="17"/>
                 <w:szCs w:val="17"/>
               </w:rPr>
-              <w:t xml:space="preserve">60</w:t>
+              <w:t xml:space="preserve">59</w:t>
             </w:r>
           </w:p>
         </w:tc>
@@ -1538,7 +1538,7 @@
                 <w:sz w:val="17"/>
                 <w:szCs w:val="17"/>
               </w:rPr>
-              <w:t xml:space="preserve">60</w:t>
+              <w:t xml:space="preserve">59</w:t>
             </w:r>
           </w:p>
         </w:tc>
@@ -1870,7 +1870,7 @@
                 <w:sz w:val="16"/>
                 <w:szCs w:val="16"/>
               </w:rPr>
-              <w:t xml:space="preserve">18</w:t>
+              <w:t xml:space="preserve">17</w:t>
             </w:r>
           </w:p>
           <w:p>
@@ -1887,7 +1887,7 @@
                 <w:sz w:val="16"/>
                 <w:szCs w:val="16"/>
               </w:rPr>
-              <w:t xml:space="preserve">Пункты 1.6–1.18 — документы раздела 1 программы FAT, не вошедшие в комплект, предъявленный Продавцом.</w:t>
+              <w:t xml:space="preserve">Пункты 1.6–1.17 — документы раздела 1 программы FAT, не вошедшие в комплект, предъявленный Продавцом.</w:t>
             </w:r>
           </w:p>
         </w:tc>
@@ -1932,7 +1932,7 @@
                 <w:sz w:val="16"/>
                 <w:szCs w:val="16"/>
               </w:rPr>
-              <w:t xml:space="preserve">18</w:t>
+              <w:t xml:space="preserve">17</w:t>
             </w:r>
           </w:p>
           <w:p>
@@ -1949,7 +1949,7 @@
                 <w:sz w:val="16"/>
                 <w:szCs w:val="16"/>
               </w:rPr>
-              <w:t xml:space="preserve">Items 1.6–1.18 are documents under section 1 of the FAT programme not included in the set presented by the Seller.</w:t>
+              <w:t xml:space="preserve">Items 1.6–1.17 are documents under section 1 of the FAT programme not included in the set presented by the Seller.</w:t>
             </w:r>
           </w:p>
         </w:tc>
@@ -1994,7 +1994,7 @@
                 <w:sz w:val="16"/>
                 <w:szCs w:val="16"/>
               </w:rPr>
-              <w:t xml:space="preserve">18</w:t>
+              <w:t xml:space="preserve">17</w:t>
             </w:r>
           </w:p>
           <w:p>
@@ -2011,7 +2011,7 @@
                 <w:sz w:val="16"/>
                 <w:szCs w:val="16"/>
               </w:rPr>
-              <w:t xml:space="preserve">第 1.6–1.18 项为 FAT 大纲第 1 章所列、卖方提交文件中缺少的文件。</w:t>
+              <w:t xml:space="preserve">第 1.6–1.17 项为 FAT 大纲第 1 章所列、卖方提交文件中缺少的文件。</w:t>
             </w:r>
           </w:p>
         </w:tc>
@@ -4995,137 +4995,6 @@
                 <w:szCs w:val="17"/>
               </w:rPr>
               <w:t xml:space="preserve">运输分包方案图（含外形尺寸和重量）（FAT 大纲第 18 项）。</w:t>
-            </w:r>
-          </w:p>
-        </w:tc>
-      </w:tr>
-      <w:tr>
-        <w:trPr>
-          <w:cantSplit/>
-        </w:trPr>
-        <w:tc>
-          <w:tcPr>
-            <w:tcW w:type="dxa" w:w="5084"/>
-            <w:tcBorders>
-              <w:top w:val="none" w:color="FFFFFF" w:sz="0"/>
-              <w:left w:val="none" w:color="FFFFFF" w:sz="0"/>
-              <w:bottom w:val="single" w:color="C9D3E0" w:sz="2"/>
-              <w:right w:val="single" w:color="C9D3E0" w:sz="2"/>
-            </w:tcBorders>
-            <w:tcMar>
-              <w:top w:type="dxa" w:w="80"/>
-              <w:left w:type="dxa" w:w="120"/>
-              <w:bottom w:type="dxa" w:w="80"/>
-              <w:right w:type="dxa" w:w="120"/>
-            </w:tcMar>
-            <w:vAlign w:val="top"/>
-          </w:tcPr>
-          <w:p>
-            <w:pPr>
-              <w:spacing w:after="0" w:line="264"/>
-            </w:pPr>
-            <w:r>
-              <w:rPr>
-                <w:rFonts w:ascii="Calibri" w:cs="Calibri" w:eastAsia="Microsoft YaHei" w:hAnsi="Calibri"/>
-                <w:b/>
-                <w:bCs/>
-                <w:color w:val="B4541A"/>
-                <w:sz w:val="17"/>
-                <w:szCs w:val="17"/>
-              </w:rPr>
-              <w:t xml:space="preserve">1.18  </w:t>
-            </w:r>
-            <w:r>
-              <w:rPr>
-                <w:rFonts w:ascii="Calibri" w:cs="Calibri" w:eastAsia="Microsoft YaHei" w:hAnsi="Calibri"/>
-                <w:sz w:val="17"/>
-                <w:szCs w:val="17"/>
-              </w:rPr>
-              <w:t xml:space="preserve">Протоколы балансировки роторов E-102 и E-202 (G 6.3) (разд. 9, п. 5 программы FAT).</w:t>
-            </w:r>
-          </w:p>
-        </w:tc>
-        <w:tc>
-          <w:tcPr>
-            <w:tcW w:type="dxa" w:w="5084"/>
-            <w:tcBorders>
-              <w:top w:val="none" w:color="FFFFFF" w:sz="0"/>
-              <w:left w:val="none" w:color="FFFFFF" w:sz="0"/>
-              <w:bottom w:val="single" w:color="C9D3E0" w:sz="2"/>
-              <w:right w:val="single" w:color="C9D3E0" w:sz="2"/>
-            </w:tcBorders>
-            <w:tcMar>
-              <w:top w:type="dxa" w:w="80"/>
-              <w:left w:type="dxa" w:w="120"/>
-              <w:bottom w:type="dxa" w:w="80"/>
-              <w:right w:type="dxa" w:w="120"/>
-            </w:tcMar>
-            <w:vAlign w:val="top"/>
-          </w:tcPr>
-          <w:p>
-            <w:pPr>
-              <w:spacing w:after="0" w:line="264"/>
-            </w:pPr>
-            <w:r>
-              <w:rPr>
-                <w:rFonts w:ascii="Calibri" w:cs="Calibri" w:eastAsia="Microsoft YaHei" w:hAnsi="Calibri"/>
-                <w:b/>
-                <w:bCs/>
-                <w:color w:val="B4541A"/>
-                <w:sz w:val="17"/>
-                <w:szCs w:val="17"/>
-              </w:rPr>
-              <w:t xml:space="preserve">1.18  </w:t>
-            </w:r>
-            <w:r>
-              <w:rPr>
-                <w:rFonts w:ascii="Calibri" w:cs="Calibri" w:eastAsia="Microsoft YaHei" w:hAnsi="Calibri"/>
-                <w:sz w:val="17"/>
-                <w:szCs w:val="17"/>
-              </w:rPr>
-              <w:t xml:space="preserve">Balancing reports for the E-102 and E-202 rotors (G 6.3) (FAT programme, section 9, item 5).</w:t>
-            </w:r>
-          </w:p>
-        </w:tc>
-        <w:tc>
-          <w:tcPr>
-            <w:tcW w:type="dxa" w:w="5084"/>
-            <w:tcBorders>
-              <w:top w:val="none" w:color="FFFFFF" w:sz="0"/>
-              <w:left w:val="none" w:color="FFFFFF" w:sz="0"/>
-              <w:bottom w:val="single" w:color="C9D3E0" w:sz="2"/>
-              <w:right w:val="none" w:color="FFFFFF" w:sz="0"/>
-            </w:tcBorders>
-            <w:tcMar>
-              <w:top w:type="dxa" w:w="80"/>
-              <w:left w:type="dxa" w:w="120"/>
-              <w:bottom w:type="dxa" w:w="80"/>
-              <w:right w:type="dxa" w:w="120"/>
-            </w:tcMar>
-            <w:vAlign w:val="top"/>
-          </w:tcPr>
-          <w:p>
-            <w:pPr>
-              <w:spacing w:after="0" w:line="264"/>
-            </w:pPr>
-            <w:r>
-              <w:rPr>
-                <w:rFonts w:ascii="Calibri" w:cs="Calibri" w:eastAsia="Microsoft YaHei" w:hAnsi="Calibri"/>
-                <w:b/>
-                <w:bCs/>
-                <w:color w:val="B4541A"/>
-                <w:sz w:val="17"/>
-                <w:szCs w:val="17"/>
-              </w:rPr>
-              <w:t xml:space="preserve">1.18  </w:t>
-            </w:r>
-            <w:r>
-              <w:rPr>
-                <w:rFonts w:ascii="Calibri" w:cs="Calibri" w:eastAsia="Microsoft YaHei" w:hAnsi="Calibri"/>
-                <w:sz w:val="17"/>
-                <w:szCs w:val="17"/>
-              </w:rPr>
-              <w:t xml:space="preserve">E-102 和 E-202 转子动平衡报告（G 6.3）（FAT 大纲第 9 章第 5 项）。</w:t>
             </w:r>
           </w:p>
         </w:tc>

</xml_diff>

<commit_message>
Acceptance test report: remove shipping split diagram item
Co-Authored-By: Claude Opus 5.5 <noreply@anthropic.com>
Claude-Session: https://claude.ai/code/session_01DhfrxujFdtSZWrLQm5rNqB
</commit_message>
<xml_diff>
--- a/Акт_приемочных_испытаний_RU-EN-CN.docx
+++ b/Акт_приемочных_испытаний_RU-EN-CN.docx
@@ -1460,7 +1460,7 @@
                 <w:sz w:val="17"/>
                 <w:szCs w:val="17"/>
               </w:rPr>
-              <w:t xml:space="preserve">59</w:t>
+              <w:t xml:space="preserve">58</w:t>
             </w:r>
           </w:p>
         </w:tc>
@@ -1538,7 +1538,7 @@
                 <w:sz w:val="17"/>
                 <w:szCs w:val="17"/>
               </w:rPr>
-              <w:t xml:space="preserve">59</w:t>
+              <w:t xml:space="preserve">58</w:t>
             </w:r>
           </w:p>
         </w:tc>
@@ -1870,7 +1870,7 @@
                 <w:sz w:val="16"/>
                 <w:szCs w:val="16"/>
               </w:rPr>
-              <w:t xml:space="preserve">17</w:t>
+              <w:t xml:space="preserve">16</w:t>
             </w:r>
           </w:p>
           <w:p>
@@ -1887,7 +1887,7 @@
                 <w:sz w:val="16"/>
                 <w:szCs w:val="16"/>
               </w:rPr>
-              <w:t xml:space="preserve">Пункты 1.6–1.17 — документы раздела 1 программы FAT, не вошедшие в комплект, предъявленный Продавцом.</w:t>
+              <w:t xml:space="preserve">Пункты 1.6–1.16 — документы раздела 1 программы FAT, не вошедшие в комплект, предъявленный Продавцом.</w:t>
             </w:r>
           </w:p>
         </w:tc>
@@ -1932,7 +1932,7 @@
                 <w:sz w:val="16"/>
                 <w:szCs w:val="16"/>
               </w:rPr>
-              <w:t xml:space="preserve">17</w:t>
+              <w:t xml:space="preserve">16</w:t>
             </w:r>
           </w:p>
           <w:p>
@@ -1949,7 +1949,7 @@
                 <w:sz w:val="16"/>
                 <w:szCs w:val="16"/>
               </w:rPr>
-              <w:t xml:space="preserve">Items 1.6–1.17 are documents under section 1 of the FAT programme not included in the set presented by the Seller.</w:t>
+              <w:t xml:space="preserve">Items 1.6–1.16 are documents under section 1 of the FAT programme not included in the set presented by the Seller.</w:t>
             </w:r>
           </w:p>
         </w:tc>
@@ -1994,7 +1994,7 @@
                 <w:sz w:val="16"/>
                 <w:szCs w:val="16"/>
               </w:rPr>
-              <w:t xml:space="preserve">17</w:t>
+              <w:t xml:space="preserve">16</w:t>
             </w:r>
           </w:p>
           <w:p>
@@ -2011,7 +2011,7 @@
                 <w:sz w:val="16"/>
                 <w:szCs w:val="16"/>
               </w:rPr>
-              <w:t xml:space="preserve">第 1.6–1.17 项为 FAT 大纲第 1 章所列、卖方提交文件中缺少的文件。</w:t>
+              <w:t xml:space="preserve">第 1.6–1.16 项为 FAT 大纲第 1 章所列、卖方提交文件中缺少的文件。</w:t>
             </w:r>
           </w:p>
         </w:tc>
@@ -4864,137 +4864,6 @@
                 <w:szCs w:val="17"/>
               </w:rPr>
               <w:t xml:space="preserve">整套装置、蒸发器 E-102/E-202、齿轮泵、冷水机、控制柜的安装、操作和维护手册（IOM）（仅提交了真空泵的手册）（FAT 大纲第 16 项）。</w:t>
-            </w:r>
-          </w:p>
-        </w:tc>
-      </w:tr>
-      <w:tr>
-        <w:trPr>
-          <w:cantSplit/>
-        </w:trPr>
-        <w:tc>
-          <w:tcPr>
-            <w:tcW w:type="dxa" w:w="5084"/>
-            <w:tcBorders>
-              <w:top w:val="none" w:color="FFFFFF" w:sz="0"/>
-              <w:left w:val="none" w:color="FFFFFF" w:sz="0"/>
-              <w:bottom w:val="single" w:color="C9D3E0" w:sz="2"/>
-              <w:right w:val="single" w:color="C9D3E0" w:sz="2"/>
-            </w:tcBorders>
-            <w:tcMar>
-              <w:top w:type="dxa" w:w="80"/>
-              <w:left w:type="dxa" w:w="120"/>
-              <w:bottom w:type="dxa" w:w="80"/>
-              <w:right w:type="dxa" w:w="120"/>
-            </w:tcMar>
-            <w:vAlign w:val="top"/>
-          </w:tcPr>
-          <w:p>
-            <w:pPr>
-              <w:spacing w:after="0" w:line="264"/>
-            </w:pPr>
-            <w:r>
-              <w:rPr>
-                <w:rFonts w:ascii="Calibri" w:cs="Calibri" w:eastAsia="Microsoft YaHei" w:hAnsi="Calibri"/>
-                <w:b/>
-                <w:bCs/>
-                <w:color w:val="B4541A"/>
-                <w:sz w:val="17"/>
-                <w:szCs w:val="17"/>
-              </w:rPr>
-              <w:t xml:space="preserve">1.17  </w:t>
-            </w:r>
-            <w:r>
-              <w:rPr>
-                <w:rFonts w:ascii="Calibri" w:cs="Calibri" w:eastAsia="Microsoft YaHei" w:hAnsi="Calibri"/>
-                <w:sz w:val="17"/>
-                <w:szCs w:val="17"/>
-              </w:rPr>
-              <w:t xml:space="preserve">Схема разделения на транспортные места с габаритами и массами (п. 18 программы FAT).</w:t>
-            </w:r>
-          </w:p>
-        </w:tc>
-        <w:tc>
-          <w:tcPr>
-            <w:tcW w:type="dxa" w:w="5084"/>
-            <w:tcBorders>
-              <w:top w:val="none" w:color="FFFFFF" w:sz="0"/>
-              <w:left w:val="none" w:color="FFFFFF" w:sz="0"/>
-              <w:bottom w:val="single" w:color="C9D3E0" w:sz="2"/>
-              <w:right w:val="single" w:color="C9D3E0" w:sz="2"/>
-            </w:tcBorders>
-            <w:tcMar>
-              <w:top w:type="dxa" w:w="80"/>
-              <w:left w:type="dxa" w:w="120"/>
-              <w:bottom w:type="dxa" w:w="80"/>
-              <w:right w:type="dxa" w:w="120"/>
-            </w:tcMar>
-            <w:vAlign w:val="top"/>
-          </w:tcPr>
-          <w:p>
-            <w:pPr>
-              <w:spacing w:after="0" w:line="264"/>
-            </w:pPr>
-            <w:r>
-              <w:rPr>
-                <w:rFonts w:ascii="Calibri" w:cs="Calibri" w:eastAsia="Microsoft YaHei" w:hAnsi="Calibri"/>
-                <w:b/>
-                <w:bCs/>
-                <w:color w:val="B4541A"/>
-                <w:sz w:val="17"/>
-                <w:szCs w:val="17"/>
-              </w:rPr>
-              <w:t xml:space="preserve">1.17  </w:t>
-            </w:r>
-            <w:r>
-              <w:rPr>
-                <w:rFonts w:ascii="Calibri" w:cs="Calibri" w:eastAsia="Microsoft YaHei" w:hAnsi="Calibri"/>
-                <w:sz w:val="17"/>
-                <w:szCs w:val="17"/>
-              </w:rPr>
-              <w:t xml:space="preserve">Shipping split diagram with dimensions and weights (FAT programme, item 18).</w:t>
-            </w:r>
-          </w:p>
-        </w:tc>
-        <w:tc>
-          <w:tcPr>
-            <w:tcW w:type="dxa" w:w="5084"/>
-            <w:tcBorders>
-              <w:top w:val="none" w:color="FFFFFF" w:sz="0"/>
-              <w:left w:val="none" w:color="FFFFFF" w:sz="0"/>
-              <w:bottom w:val="single" w:color="C9D3E0" w:sz="2"/>
-              <w:right w:val="none" w:color="FFFFFF" w:sz="0"/>
-            </w:tcBorders>
-            <w:tcMar>
-              <w:top w:type="dxa" w:w="80"/>
-              <w:left w:type="dxa" w:w="120"/>
-              <w:bottom w:type="dxa" w:w="80"/>
-              <w:right w:type="dxa" w:w="120"/>
-            </w:tcMar>
-            <w:vAlign w:val="top"/>
-          </w:tcPr>
-          <w:p>
-            <w:pPr>
-              <w:spacing w:after="0" w:line="264"/>
-            </w:pPr>
-            <w:r>
-              <w:rPr>
-                <w:rFonts w:ascii="Calibri" w:cs="Calibri" w:eastAsia="Microsoft YaHei" w:hAnsi="Calibri"/>
-                <w:b/>
-                <w:bCs/>
-                <w:color w:val="B4541A"/>
-                <w:sz w:val="17"/>
-                <w:szCs w:val="17"/>
-              </w:rPr>
-              <w:t xml:space="preserve">1.17  </w:t>
-            </w:r>
-            <w:r>
-              <w:rPr>
-                <w:rFonts w:ascii="Calibri" w:cs="Calibri" w:eastAsia="Microsoft YaHei" w:hAnsi="Calibri"/>
-                <w:sz w:val="17"/>
-                <w:szCs w:val="17"/>
-              </w:rPr>
-              <w:t xml:space="preserve">运输分包方案图（含外形尺寸和重量）（FAT 大纲第 18 项）。</w:t>
             </w:r>
           </w:p>
         </w:tc>

</xml_diff>

<commit_message>
Acceptance test report: revise items 2.6, 4.3, 4.6
Co-Authored-By: Claude Opus 5.5 <noreply@anthropic.com>
Claude-Session: https://claude.ai/code/session_01DhfrxujFdtSZWrLQm5rNqB
</commit_message>
<xml_diff>
--- a/Акт_приемочных_испытаний_RU-EN-CN.docx
+++ b/Акт_приемочных_испытаний_RU-EN-CN.docx
@@ -5851,7 +5851,7 @@
                 <w:sz w:val="17"/>
                 <w:szCs w:val="17"/>
               </w:rPr>
-              <w:t xml:space="preserve">В комплекте ЗИП отсутствует шестерённый насос в сборе.</w:t>
+              <w:t xml:space="preserve">В комплекте ЗИП должен быть шестерённый насос в сборе 12CC, а не 10CC.</w:t>
             </w:r>
           </w:p>
         </w:tc>
@@ -5893,7 +5893,7 @@
                 <w:sz w:val="17"/>
                 <w:szCs w:val="17"/>
               </w:rPr>
-              <w:t xml:space="preserve">A complete gear pump assembly is missing from the spare parts kit.</w:t>
+              <w:t xml:space="preserve">The spare parts kit shall include a complete 12CC gear pump assembly, not a 10CC one.</w:t>
             </w:r>
           </w:p>
         </w:tc>
@@ -5935,7 +5935,7 @@
                 <w:sz w:val="17"/>
                 <w:szCs w:val="17"/>
               </w:rPr>
-              <w:t xml:space="preserve">备品备件中缺少一台完整的齿轮泵总成。</w:t>
+              <w:t xml:space="preserve">备品备件中的齿轮泵总成应为 12CC，而非 10CC。</w:t>
             </w:r>
           </w:p>
         </w:tc>
@@ -8483,7 +8483,7 @@
                 <w:sz w:val="17"/>
                 <w:szCs w:val="17"/>
               </w:rPr>
-              <w:t xml:space="preserve">Отсутствуют подключения теплоносителя насоса Р-101.</w:t>
+              <w:t xml:space="preserve">Отсутствуют подключения теплоносителя всех шестерённых насосов.</w:t>
             </w:r>
             <w:r>
               <w:rPr>
@@ -8534,7 +8534,7 @@
                 <w:sz w:val="17"/>
                 <w:szCs w:val="17"/>
               </w:rPr>
-              <w:t xml:space="preserve">The heat transfer fluid connections of pump P-101 are missing.</w:t>
+              <w:t xml:space="preserve">The heat transfer fluid connections of all gear pumps are missing.</w:t>
             </w:r>
             <w:r>
               <w:rPr>
@@ -8585,7 +8585,7 @@
                 <w:sz w:val="17"/>
                 <w:szCs w:val="17"/>
               </w:rPr>
-              <w:t xml:space="preserve">泵 P-101 缺少热媒接口连接。</w:t>
+              <w:t xml:space="preserve">所有齿轮泵均缺少热媒连接。</w:t>
             </w:r>
             <w:r>
               <w:rPr>
@@ -8957,7 +8957,7 @@
                 <w:sz w:val="17"/>
                 <w:szCs w:val="17"/>
               </w:rPr>
-              <w:t xml:space="preserve">Фланцы трубопроводов теплоносителя мешают подключению (в трёх местах), в том числе фланец на кране BV-008 (слив тяжёлой фракции 1-й ступени). Исправить путём переваривания колб, а не кранов.</w:t>
+              <w:t xml:space="preserve">Фланцы трубопроводов теплоносителя мешают подключению (в трёх местах), в том числе фланец на кране BV-008 (слив тяжёлой фракции 1-й ступени). Исправить путём переваривания фланца теплоносителя на ёмкости или насосе, а не на кранах.</w:t>
             </w:r>
             <w:r>
               <w:rPr>
@@ -9008,7 +9008,7 @@
                 <w:sz w:val="17"/>
                 <w:szCs w:val="17"/>
               </w:rPr>
-              <w:t xml:space="preserve">The flanges of the heat transfer fluid lines obstruct the connection (at three locations), including the flange on valve BV-008 (1st stage heavy fraction drain). To be rectified by re-welding the flasks, not the valves.</w:t>
+              <w:t xml:space="preserve">The flanges of the heat transfer fluid lines obstruct the connection (at three locations), including the flange on valve BV-008 (1st stage heavy fraction drain). To be rectified by re-welding the heat transfer fluid flange on the vessel or pump, not on the valves.</w:t>
             </w:r>
             <w:r>
               <w:rPr>
@@ -9059,7 +9059,7 @@
                 <w:sz w:val="17"/>
                 <w:szCs w:val="17"/>
               </w:rPr>
-              <w:t xml:space="preserve">热媒管路法兰妨碍连接（共三处），包括阀门 BV-008（一级重组分排出）上的法兰。须通过重新焊接瓶体（而非阀门）进行整改。</w:t>
+              <w:t xml:space="preserve">热媒管路法兰妨碍连接（共三处），包括阀门 BV-008（一级重组分排出）上的法兰。须通过在容器或泵上重新焊接热媒法兰（而非在阀门上）进行整改。</w:t>
             </w:r>
             <w:r>
               <w:rPr>
@@ -14942,7 +14942,7 @@
                 <wp:inline distT="0" distB="0" distL="0" distR="0">
                   <wp:extent cx="1466850" cy="1952625"/>
                   <wp:effectExtent t="0" r="0" b="0" l="0"/>
-                  <wp:docPr id="1" name="photo8" descr="Heat transfer fluid connections of pump P-101 missing" title="Фото 8"/>
+                  <wp:docPr id="1" name="photo8" descr="Heat transfer fluid connections of the gear pumps missing" title="Фото 8"/>
                   <wp:cNvGraphicFramePr>
                     <a:graphicFrameLocks xmlns:a="http://schemas.openxmlformats.org/drawingml/2006/main" noChangeAspect="1"/>
                   </wp:cNvGraphicFramePr>
@@ -15000,7 +15000,7 @@
                 <w:sz w:val="15"/>
                 <w:szCs w:val="15"/>
               </w:rPr>
-              <w:t xml:space="preserve">Отсутствуют подключения теплоносителя насоса Р-101 (п. 4.3)</w:t>
+              <w:t xml:space="preserve">Отсутствуют подключения теплоносителя шестерённых насосов (п. 4.3)</w:t>
             </w:r>
           </w:p>
           <w:p>
@@ -15026,7 +15026,7 @@
                 <w:sz w:val="15"/>
                 <w:szCs w:val="15"/>
               </w:rPr>
-              <w:t xml:space="preserve">Heat transfer fluid connections of pump P-101 missing (item 4.3)</w:t>
+              <w:t xml:space="preserve">Heat transfer fluid connections of the gear pumps missing (item 4.3)</w:t>
             </w:r>
           </w:p>
           <w:p>
@@ -15052,7 +15052,7 @@
                 <w:sz w:val="15"/>
                 <w:szCs w:val="15"/>
               </w:rPr>
-              <w:t xml:space="preserve">泵 P-101 缺少热媒连接（第 4.3 项）</w:t>
+              <w:t xml:space="preserve">齿轮泵缺少热媒连接（第 4.3 项）</w:t>
             </w:r>
           </w:p>
         </w:tc>

</xml_diff>

<commit_message>
Acceptance test report: revise 2.2, 2.4, 3.1; add second photo to washers item
Co-Authored-By: Claude Opus 5.5 <noreply@anthropic.com>
Claude-Session: https://claude.ai/code/session_01DhfrxujFdtSZWrLQm5rNqB
</commit_message>
<xml_diff>
--- a/Акт_приемочных_испытаний_RU-EN-CN.docx
+++ b/Акт_приемочных_испытаний_RU-EN-CN.docx
@@ -5327,7 +5327,7 @@
                 <w:sz w:val="17"/>
                 <w:szCs w:val="17"/>
               </w:rPr>
-              <w:t xml:space="preserve">Уточнить, предусмотрена ли контрактом теплоизоляция рубашек.</w:t>
+              <w:t xml:space="preserve">Отсутствует теплоизоляция рубашек всех ёмкостей и колонн установки.</w:t>
             </w:r>
           </w:p>
         </w:tc>
@@ -5369,7 +5369,7 @@
                 <w:sz w:val="17"/>
                 <w:szCs w:val="17"/>
               </w:rPr>
-              <w:t xml:space="preserve">To be clarified whether thermal insulation of the jackets is included in the contract.</w:t>
+              <w:t xml:space="preserve">Thermal insulation of the jackets of all vessels and columns of the unit is missing.</w:t>
             </w:r>
           </w:p>
         </w:tc>
@@ -5411,7 +5411,7 @@
                 <w:sz w:val="17"/>
                 <w:szCs w:val="17"/>
               </w:rPr>
-              <w:t xml:space="preserve">须确认合同是否包含夹套保温。</w:t>
+              <w:t xml:space="preserve">装置所有容器和塔的夹套均缺少保温。</w:t>
             </w:r>
           </w:p>
         </w:tc>
@@ -5589,7 +5589,7 @@
                 <w:sz w:val="17"/>
                 <w:szCs w:val="17"/>
               </w:rPr>
-              <w:t xml:space="preserve">Просим включить в комплектность установки 4 заглушки на участок в обход байпасов (между двумя трёхходовыми кранами).</w:t>
+              <w:t xml:space="preserve">Просим включить в комплектность установки 4 нержавеющих фланца-заглушки на участок в обход байпасов (между двумя трёхходовыми кранами).</w:t>
             </w:r>
           </w:p>
         </w:tc>
@@ -5631,7 +5631,7 @@
                 <w:sz w:val="17"/>
                 <w:szCs w:val="17"/>
               </w:rPr>
-              <w:t xml:space="preserve">We request that four blanking plugs for the bypass sections (between the two three-way valves) be included in the scope of supply of the unit.</w:t>
+              <w:t xml:space="preserve">We request that four stainless steel blind flanges for the bypass sections (between the two three-way valves) be included in the scope of supply of the unit.</w:t>
             </w:r>
           </w:p>
         </w:tc>
@@ -5673,7 +5673,7 @@
                 <w:sz w:val="17"/>
                 <w:szCs w:val="17"/>
               </w:rPr>
-              <w:t xml:space="preserve">请将 4 个用于旁路段（两个三通阀之间）的盲堵纳入装置供货范围。</w:t>
+              <w:t xml:space="preserve">请将 4 个用于旁路段（两个三通阀之间）的不锈钢盲板法兰纳入装置供货范围。</w:t>
             </w:r>
           </w:p>
         </w:tc>
@@ -6296,7 +6296,7 @@
                 <w:sz w:val="17"/>
                 <w:szCs w:val="17"/>
               </w:rPr>
-              <w:t xml:space="preserve">–  запасной ротор с двигателем и ротационным уплотнением: удалить ламели и выполнить балансировку (за дополнительную плату);</w:t>
+              <w:t xml:space="preserve">–  запасной ротор с двигателем и ротационным уплотнением: удалить ламели и выполнить балансировку;</w:t>
             </w:r>
           </w:p>
           <w:p>
@@ -6310,7 +6310,7 @@
                 <w:sz w:val="17"/>
                 <w:szCs w:val="17"/>
               </w:rPr>
-              <w:t xml:space="preserve">–  изготовить дополнительный ротор с балансировкой, без двигателя и двойного ротационного уплотнения (за дополнительную плату);</w:t>
+              <w:t xml:space="preserve">–  изготовить дополнительный ротор с балансировкой, без двигателя и двойного ротационного уплотнения;</w:t>
             </w:r>
           </w:p>
           <w:p>
@@ -6394,7 +6394,7 @@
                 <w:sz w:val="17"/>
                 <w:szCs w:val="17"/>
               </w:rPr>
-              <w:t xml:space="preserve">–  spare rotor with motor and rotary seal: remove the lamellas and balance the rotor (at additional cost);</w:t>
+              <w:t xml:space="preserve">–  spare rotor with motor and rotary seal: remove the lamellas and balance the rotor;</w:t>
             </w:r>
           </w:p>
           <w:p>
@@ -6408,7 +6408,7 @@
                 <w:sz w:val="17"/>
                 <w:szCs w:val="17"/>
               </w:rPr>
-              <w:t xml:space="preserve">–  manufacture an additional balanced rotor, without motor and double rotary seal (at additional cost);</w:t>
+              <w:t xml:space="preserve">–  manufacture an additional balanced rotor, without motor and double rotary seal;</w:t>
             </w:r>
           </w:p>
           <w:p>
@@ -6492,7 +6492,7 @@
                 <w:sz w:val="17"/>
                 <w:szCs w:val="17"/>
               </w:rPr>
-              <w:t xml:space="preserve">–  带电机和旋转密封的备用转子：拆除刮片并做动平衡（另行收费）；</w:t>
+              <w:t xml:space="preserve">–  带电机和旋转密封的备用转子：拆除刮片并做动平衡；</w:t>
             </w:r>
           </w:p>
           <w:p>
@@ -6506,7 +6506,7 @@
                 <w:sz w:val="17"/>
                 <w:szCs w:val="17"/>
               </w:rPr>
-              <w:t xml:space="preserve">–  另制作一个经动平衡的转子，不含电机和双旋转密封（另行收费）；</w:t>
+              <w:t xml:space="preserve">–  另制作一个经动平衡的转子，不含电机和双旋转密封；</w:t>
             </w:r>
           </w:p>
           <w:p>
@@ -9124,7 +9124,7 @@
                 <w:sz w:val="16"/>
                 <w:szCs w:val="16"/>
               </w:rPr>
-              <w:t xml:space="preserve">  (Фото 12)</w:t>
+              <w:t xml:space="preserve">  (Фото 12, 13)</w:t>
             </w:r>
           </w:p>
         </w:tc>
@@ -9175,7 +9175,7 @@
                 <w:sz w:val="16"/>
                 <w:szCs w:val="16"/>
               </w:rPr>
-              <w:t xml:space="preserve">  (Photo 12)</w:t>
+              <w:t xml:space="preserve">  (Photo 12, 13)</w:t>
             </w:r>
           </w:p>
         </w:tc>
@@ -9226,7 +9226,7 @@
                 <w:sz w:val="16"/>
                 <w:szCs w:val="16"/>
               </w:rPr>
-              <w:t xml:space="preserve">  (照片 12)</w:t>
+              <w:t xml:space="preserve">  (照片 12, 13)</w:t>
             </w:r>
           </w:p>
         </w:tc>
@@ -9282,7 +9282,7 @@
                 <w:sz w:val="16"/>
                 <w:szCs w:val="16"/>
               </w:rPr>
-              <w:t xml:space="preserve">  (Фото 13)</w:t>
+              <w:t xml:space="preserve">  (Фото 14)</w:t>
             </w:r>
           </w:p>
         </w:tc>
@@ -9333,7 +9333,7 @@
                 <w:sz w:val="16"/>
                 <w:szCs w:val="16"/>
               </w:rPr>
-              <w:t xml:space="preserve">  (Photo 13)</w:t>
+              <w:t xml:space="preserve">  (Photo 14)</w:t>
             </w:r>
           </w:p>
         </w:tc>
@@ -9384,7 +9384,7 @@
                 <w:sz w:val="16"/>
                 <w:szCs w:val="16"/>
               </w:rPr>
-              <w:t xml:space="preserve">  (照片 13)</w:t>
+              <w:t xml:space="preserve">  (照片 14)</w:t>
             </w:r>
           </w:p>
         </w:tc>
@@ -9440,7 +9440,7 @@
                 <w:sz w:val="16"/>
                 <w:szCs w:val="16"/>
               </w:rPr>
-              <w:t xml:space="preserve">  (Фото 14)</w:t>
+              <w:t xml:space="preserve">  (Фото 15)</w:t>
             </w:r>
           </w:p>
         </w:tc>
@@ -9491,7 +9491,7 @@
                 <w:sz w:val="16"/>
                 <w:szCs w:val="16"/>
               </w:rPr>
-              <w:t xml:space="preserve">  (Photo 14)</w:t>
+              <w:t xml:space="preserve">  (Photo 15)</w:t>
             </w:r>
           </w:p>
         </w:tc>
@@ -9542,7 +9542,7 @@
                 <w:sz w:val="16"/>
                 <w:szCs w:val="16"/>
               </w:rPr>
-              <w:t xml:space="preserve">  (照片 14)</w:t>
+              <w:t xml:space="preserve">  (照片 15)</w:t>
             </w:r>
           </w:p>
         </w:tc>
@@ -9598,7 +9598,7 @@
                 <w:sz w:val="16"/>
                 <w:szCs w:val="16"/>
               </w:rPr>
-              <w:t xml:space="preserve">  (Фото 15)</w:t>
+              <w:t xml:space="preserve">  (Фото 16)</w:t>
             </w:r>
           </w:p>
         </w:tc>
@@ -9649,7 +9649,7 @@
                 <w:sz w:val="16"/>
                 <w:szCs w:val="16"/>
               </w:rPr>
-              <w:t xml:space="preserve">  (Photo 15)</w:t>
+              <w:t xml:space="preserve">  (Photo 16)</w:t>
             </w:r>
           </w:p>
         </w:tc>
@@ -9700,7 +9700,7 @@
                 <w:sz w:val="16"/>
                 <w:szCs w:val="16"/>
               </w:rPr>
-              <w:t xml:space="preserve">  (照片 15)</w:t>
+              <w:t xml:space="preserve">  (照片 16)</w:t>
             </w:r>
           </w:p>
         </w:tc>
@@ -9756,7 +9756,7 @@
                 <w:sz w:val="16"/>
                 <w:szCs w:val="16"/>
               </w:rPr>
-              <w:t xml:space="preserve">  (Фото 16, 17)</w:t>
+              <w:t xml:space="preserve">  (Фото 17, 18)</w:t>
             </w:r>
           </w:p>
         </w:tc>
@@ -9807,7 +9807,7 @@
                 <w:sz w:val="16"/>
                 <w:szCs w:val="16"/>
               </w:rPr>
-              <w:t xml:space="preserve">  (Photo 16, 17)</w:t>
+              <w:t xml:space="preserve">  (Photo 17, 18)</w:t>
             </w:r>
           </w:p>
         </w:tc>
@@ -9858,7 +9858,7 @@
                 <w:sz w:val="16"/>
                 <w:szCs w:val="16"/>
               </w:rPr>
-              <w:t xml:space="preserve">  (照片 16, 17)</w:t>
+              <w:t xml:space="preserve">  (照片 17, 18)</w:t>
             </w:r>
           </w:p>
         </w:tc>
@@ -9914,7 +9914,7 @@
                 <w:sz w:val="16"/>
                 <w:szCs w:val="16"/>
               </w:rPr>
-              <w:t xml:space="preserve">  (Фото 18)</w:t>
+              <w:t xml:space="preserve">  (Фото 19)</w:t>
             </w:r>
           </w:p>
         </w:tc>
@@ -9965,7 +9965,7 @@
                 <w:sz w:val="16"/>
                 <w:szCs w:val="16"/>
               </w:rPr>
-              <w:t xml:space="preserve">  (Photo 18)</w:t>
+              <w:t xml:space="preserve">  (Photo 19)</w:t>
             </w:r>
           </w:p>
         </w:tc>
@@ -10016,7 +10016,7 @@
                 <w:sz w:val="16"/>
                 <w:szCs w:val="16"/>
               </w:rPr>
-              <w:t xml:space="preserve">  (照片 18)</w:t>
+              <w:t xml:space="preserve">  (照片 19)</w:t>
             </w:r>
           </w:p>
         </w:tc>
@@ -10072,7 +10072,7 @@
                 <w:sz w:val="16"/>
                 <w:szCs w:val="16"/>
               </w:rPr>
-              <w:t xml:space="preserve">  (Фото 19)</w:t>
+              <w:t xml:space="preserve">  (Фото 20)</w:t>
             </w:r>
           </w:p>
         </w:tc>
@@ -10123,7 +10123,7 @@
                 <w:sz w:val="16"/>
                 <w:szCs w:val="16"/>
               </w:rPr>
-              <w:t xml:space="preserve">  (Photo 19)</w:t>
+              <w:t xml:space="preserve">  (Photo 20)</w:t>
             </w:r>
           </w:p>
         </w:tc>
@@ -10174,7 +10174,7 @@
                 <w:sz w:val="16"/>
                 <w:szCs w:val="16"/>
               </w:rPr>
-              <w:t xml:space="preserve">  (照片 19)</w:t>
+              <w:t xml:space="preserve">  (照片 20)</w:t>
             </w:r>
           </w:p>
         </w:tc>
@@ -10770,7 +10770,7 @@
                 <w:sz w:val="16"/>
                 <w:szCs w:val="16"/>
               </w:rPr>
-              <w:t xml:space="preserve">  (Фото 20)</w:t>
+              <w:t xml:space="preserve">  (Фото 21)</w:t>
             </w:r>
           </w:p>
         </w:tc>
@@ -10821,7 +10821,7 @@
                 <w:sz w:val="16"/>
                 <w:szCs w:val="16"/>
               </w:rPr>
-              <w:t xml:space="preserve">  (Photo 20)</w:t>
+              <w:t xml:space="preserve">  (Photo 21)</w:t>
             </w:r>
           </w:p>
         </w:tc>
@@ -10872,7 +10872,7 @@
                 <w:sz w:val="16"/>
                 <w:szCs w:val="16"/>
               </w:rPr>
-              <w:t xml:space="preserve">  (照片 20)</w:t>
+              <w:t xml:space="preserve">  (照片 21)</w:t>
             </w:r>
           </w:p>
         </w:tc>
@@ -11190,7 +11190,7 @@
                 <w:sz w:val="16"/>
                 <w:szCs w:val="16"/>
               </w:rPr>
-              <w:t xml:space="preserve">  (Фото 21, 22)</w:t>
+              <w:t xml:space="preserve">  (Фото 22, 23)</w:t>
             </w:r>
           </w:p>
         </w:tc>
@@ -11241,7 +11241,7 @@
                 <w:sz w:val="16"/>
                 <w:szCs w:val="16"/>
               </w:rPr>
-              <w:t xml:space="preserve">  (Photo 21, 22)</w:t>
+              <w:t xml:space="preserve">  (Photo 22, 23)</w:t>
             </w:r>
           </w:p>
         </w:tc>
@@ -11292,7 +11292,7 @@
                 <w:sz w:val="16"/>
                 <w:szCs w:val="16"/>
               </w:rPr>
-              <w:t xml:space="preserve">  (照片 21, 22)</w:t>
+              <w:t xml:space="preserve">  (照片 22, 23)</w:t>
             </w:r>
           </w:p>
         </w:tc>
@@ -11348,7 +11348,7 @@
                 <w:sz w:val="16"/>
                 <w:szCs w:val="16"/>
               </w:rPr>
-              <w:t xml:space="preserve">  (Фото 23)</w:t>
+              <w:t xml:space="preserve">  (Фото 24)</w:t>
             </w:r>
           </w:p>
         </w:tc>
@@ -11399,7 +11399,7 @@
                 <w:sz w:val="16"/>
                 <w:szCs w:val="16"/>
               </w:rPr>
-              <w:t xml:space="preserve">  (Photo 23)</w:t>
+              <w:t xml:space="preserve">  (Photo 24)</w:t>
             </w:r>
           </w:p>
         </w:tc>
@@ -11450,7 +11450,7 @@
                 <w:sz w:val="16"/>
                 <w:szCs w:val="16"/>
               </w:rPr>
-              <w:t xml:space="preserve">  (照片 23)</w:t>
+              <w:t xml:space="preserve">  (照片 24)</w:t>
             </w:r>
           </w:p>
         </w:tc>
@@ -11506,7 +11506,7 @@
                 <w:sz w:val="16"/>
                 <w:szCs w:val="16"/>
               </w:rPr>
-              <w:t xml:space="preserve">  (Фото 24)</w:t>
+              <w:t xml:space="preserve">  (Фото 25)</w:t>
             </w:r>
           </w:p>
         </w:tc>
@@ -11557,7 +11557,7 @@
                 <w:sz w:val="16"/>
                 <w:szCs w:val="16"/>
               </w:rPr>
-              <w:t xml:space="preserve">  (Photo 24)</w:t>
+              <w:t xml:space="preserve">  (Photo 25)</w:t>
             </w:r>
           </w:p>
         </w:tc>
@@ -11608,7 +11608,7 @@
                 <w:sz w:val="16"/>
                 <w:szCs w:val="16"/>
               </w:rPr>
-              <w:t xml:space="preserve">  (照片 24)</w:t>
+              <w:t xml:space="preserve">  (照片 25)</w:t>
             </w:r>
           </w:p>
         </w:tc>
@@ -15491,6 +15491,42 @@
               <w:right w:val="none" w:color="FFFFFF" w:sz="0"/>
             </w:tcBorders>
             <w:tcMar>
+              <w:top w:type="dxa" w:w="80"/>
+              <w:left w:type="dxa" w:w="120"/>
+              <w:bottom w:type="dxa" w:w="80"/>
+              <w:right w:type="dxa" w:w="120"/>
+            </w:tcMar>
+            <w:vAlign w:val="top"/>
+          </w:tcPr>
+          <w:p>
+            <w:pPr>
+              <w:spacing w:after="40" w:before="0" w:line="264"/>
+            </w:pPr>
+            <w:r>
+              <w:rPr>
+                <w:rFonts w:ascii="Calibri" w:cs="Calibri" w:eastAsia="Microsoft YaHei" w:hAnsi="Calibri"/>
+                <w:sz w:val="17"/>
+                <w:szCs w:val="17"/>
+              </w:rPr>
+              <w:t xml:space="preserve"/>
+            </w:r>
+          </w:p>
+        </w:tc>
+      </w:tr>
+      <w:tr>
+        <w:trPr>
+          <w:cantSplit/>
+        </w:trPr>
+        <w:tc>
+          <w:tcPr>
+            <w:tcW w:type="dxa" w:w="5084"/>
+            <w:tcBorders>
+              <w:top w:val="none" w:color="FFFFFF" w:sz="0"/>
+              <w:left w:val="none" w:color="FFFFFF" w:sz="0"/>
+              <w:bottom w:val="none" w:color="FFFFFF" w:sz="0"/>
+              <w:right w:val="none" w:color="FFFFFF" w:sz="0"/>
+            </w:tcBorders>
+            <w:tcMar>
               <w:top w:type="dxa" w:w="60"/>
               <w:left w:type="dxa" w:w="120"/>
               <w:bottom w:type="dxa" w:w="160"/>
@@ -15621,11 +15657,6 @@
             </w:r>
           </w:p>
         </w:tc>
-      </w:tr>
-      <w:tr>
-        <w:trPr>
-          <w:cantSplit/>
-        </w:trPr>
         <w:tc>
           <w:tcPr>
             <w:tcW w:type="dxa" w:w="5084"/>
@@ -15650,9 +15681,9 @@
             <w:r>
               <w:drawing>
                 <wp:inline distT="0" distB="0" distL="0" distR="0">
-                  <wp:extent cx="1466850" cy="1952625"/>
+                  <wp:extent cx="2828925" cy="1952625"/>
                   <wp:effectExtent t="0" r="0" b="0" l="0"/>
-                  <wp:docPr id="1" name="photo13" descr="Two bolts missing downstream of the flowmeter" title="Фото 13"/>
+                  <wp:docPr id="1" name="photo13" descr="Washers missing on the flange connection" title="Фото 13"/>
                   <wp:cNvGraphicFramePr>
                     <a:graphicFrameLocks xmlns:a="http://schemas.openxmlformats.org/drawingml/2006/main" noChangeAspect="1"/>
                   </wp:cNvGraphicFramePr>
@@ -15675,7 +15706,7 @@
                         <pic:spPr bwMode="auto">
                           <a:xfrm>
                             <a:off x="0" y="0"/>
-                            <a:ext cx="1466850" cy="1952625"/>
+                            <a:ext cx="2828925" cy="1952625"/>
                           </a:xfrm>
                           <a:prstGeom prst="rect">
                             <a:avLst/>
@@ -15710,7 +15741,7 @@
                 <w:sz w:val="15"/>
                 <w:szCs w:val="15"/>
               </w:rPr>
-              <w:t xml:space="preserve">Отсутствуют два болта после флоуметра (п. 4.8)</w:t>
+              <w:t xml:space="preserve">Отсутствуют шайбы на фланцевом соединении (п. 4.7)</w:t>
             </w:r>
           </w:p>
           <w:p>
@@ -15736,7 +15767,7 @@
                 <w:sz w:val="15"/>
                 <w:szCs w:val="15"/>
               </w:rPr>
-              <w:t xml:space="preserve">Two bolts missing downstream of the flowmeter (item 4.8)</w:t>
+              <w:t xml:space="preserve">Washers missing on the flange connection (item 4.7)</w:t>
             </w:r>
           </w:p>
           <w:p>
@@ -15762,7 +15793,7 @@
                 <w:sz w:val="15"/>
                 <w:szCs w:val="15"/>
               </w:rPr>
-              <w:t xml:space="preserve">流量计后缺少两个螺栓（第 4.8 项）</w:t>
+              <w:t xml:space="preserve">法兰连接处缺少垫圈（第 4.7 项）</w:t>
             </w:r>
           </w:p>
         </w:tc>
@@ -15792,7 +15823,7 @@
                 <wp:inline distT="0" distB="0" distL="0" distR="0">
                   <wp:extent cx="1466850" cy="1952625"/>
                   <wp:effectExtent t="0" r="0" b="0" l="0"/>
-                  <wp:docPr id="1" name="photo14" descr="Straight branch — pipe clash" title="Фото 14"/>
+                  <wp:docPr id="1" name="photo14" descr="Two bolts missing downstream of the flowmeter" title="Фото 14"/>
                   <wp:cNvGraphicFramePr>
                     <a:graphicFrameLocks xmlns:a="http://schemas.openxmlformats.org/drawingml/2006/main" noChangeAspect="1"/>
                   </wp:cNvGraphicFramePr>
@@ -15850,7 +15881,7 @@
                 <w:sz w:val="15"/>
                 <w:szCs w:val="15"/>
               </w:rPr>
-              <w:t xml:space="preserve">Прямой отвод — конфликт трубопроводов (п. 4.9)</w:t>
+              <w:t xml:space="preserve">Отсутствуют два болта после флоуметра (п. 4.8)</w:t>
             </w:r>
           </w:p>
           <w:p>
@@ -15876,7 +15907,7 @@
                 <w:sz w:val="15"/>
                 <w:szCs w:val="15"/>
               </w:rPr>
-              <w:t xml:space="preserve">Straight branch — pipe clash (item 4.9)</w:t>
+              <w:t xml:space="preserve">Two bolts missing downstream of the flowmeter (item 4.8)</w:t>
             </w:r>
           </w:p>
           <w:p>
@@ -15902,10 +15933,15 @@
                 <w:sz w:val="15"/>
                 <w:szCs w:val="15"/>
               </w:rPr>
-              <w:t xml:space="preserve">直管段——管路干涉（第 4.9 项）</w:t>
-            </w:r>
-          </w:p>
-        </w:tc>
+              <w:t xml:space="preserve">流量计后缺少两个螺栓（第 4.8 项）</w:t>
+            </w:r>
+          </w:p>
+        </w:tc>
+      </w:tr>
+      <w:tr>
+        <w:trPr>
+          <w:cantSplit/>
+        </w:trPr>
         <w:tc>
           <w:tcPr>
             <w:tcW w:type="dxa" w:w="5084"/>
@@ -15930,9 +15966,9 @@
             <w:r>
               <w:drawing>
                 <wp:inline distT="0" distB="0" distL="0" distR="0">
-                  <wp:extent cx="2600325" cy="1952625"/>
+                  <wp:extent cx="1466850" cy="1952625"/>
                   <wp:effectExtent t="0" r="0" b="0" l="0"/>
-                  <wp:docPr id="1" name="photo15" descr="Rubber gaskets instead of PTFE" title="Фото 15"/>
+                  <wp:docPr id="1" name="photo15" descr="Straight branch — pipe clash" title="Фото 15"/>
                   <wp:cNvGraphicFramePr>
                     <a:graphicFrameLocks xmlns:a="http://schemas.openxmlformats.org/drawingml/2006/main" noChangeAspect="1"/>
                   </wp:cNvGraphicFramePr>
@@ -15955,7 +15991,7 @@
                         <pic:spPr bwMode="auto">
                           <a:xfrm>
                             <a:off x="0" y="0"/>
-                            <a:ext cx="2600325" cy="1952625"/>
+                            <a:ext cx="1466850" cy="1952625"/>
                           </a:xfrm>
                           <a:prstGeom prst="rect">
                             <a:avLst/>
@@ -15990,7 +16026,7 @@
                 <w:sz w:val="15"/>
                 <w:szCs w:val="15"/>
               </w:rPr>
-              <w:t xml:space="preserve">Резиновые прокладки вместо PTFE (п. 4.10)</w:t>
+              <w:t xml:space="preserve">Прямой отвод — конфликт трубопроводов (п. 4.9)</w:t>
             </w:r>
           </w:p>
           <w:p>
@@ -16016,7 +16052,7 @@
                 <w:sz w:val="15"/>
                 <w:szCs w:val="15"/>
               </w:rPr>
-              <w:t xml:space="preserve">Rubber gaskets instead of PTFE (item 4.10)</w:t>
+              <w:t xml:space="preserve">Straight branch — pipe clash (item 4.9)</w:t>
             </w:r>
           </w:p>
           <w:p>
@@ -16042,15 +16078,10 @@
                 <w:sz w:val="15"/>
                 <w:szCs w:val="15"/>
               </w:rPr>
-              <w:t xml:space="preserve">使用橡胶垫片而非 PTFE 垫片（第 4.10 项）</w:t>
-            </w:r>
-          </w:p>
-        </w:tc>
-      </w:tr>
-      <w:tr>
-        <w:trPr>
-          <w:cantSplit/>
-        </w:trPr>
+              <w:t xml:space="preserve">直管段——管路干涉（第 4.9 项）</w:t>
+            </w:r>
+          </w:p>
+        </w:tc>
         <w:tc>
           <w:tcPr>
             <w:tcW w:type="dxa" w:w="5084"/>
@@ -16075,9 +16106,9 @@
             <w:r>
               <w:drawing>
                 <wp:inline distT="0" distB="0" distL="0" distR="0">
-                  <wp:extent cx="1466850" cy="1952625"/>
+                  <wp:extent cx="2600325" cy="1952625"/>
                   <wp:effectExtent t="0" r="0" b="0" l="0"/>
-                  <wp:docPr id="1" name="photo16" descr="Twisted flexible hose" title="Фото 16"/>
+                  <wp:docPr id="1" name="photo16" descr="Rubber gaskets instead of PTFE" title="Фото 16"/>
                   <wp:cNvGraphicFramePr>
                     <a:graphicFrameLocks xmlns:a="http://schemas.openxmlformats.org/drawingml/2006/main" noChangeAspect="1"/>
                   </wp:cNvGraphicFramePr>
@@ -16100,7 +16131,7 @@
                         <pic:spPr bwMode="auto">
                           <a:xfrm>
                             <a:off x="0" y="0"/>
-                            <a:ext cx="1466850" cy="1952625"/>
+                            <a:ext cx="2600325" cy="1952625"/>
                           </a:xfrm>
                           <a:prstGeom prst="rect">
                             <a:avLst/>
@@ -16135,7 +16166,7 @@
                 <w:sz w:val="15"/>
                 <w:szCs w:val="15"/>
               </w:rPr>
-              <w:t xml:space="preserve">Скручивание гибкой подводки (п. 4.11)</w:t>
+              <w:t xml:space="preserve">Резиновые прокладки вместо PTFE (п. 4.10)</w:t>
             </w:r>
           </w:p>
           <w:p>
@@ -16161,7 +16192,7 @@
                 <w:sz w:val="15"/>
                 <w:szCs w:val="15"/>
               </w:rPr>
-              <w:t xml:space="preserve">Twisted flexible hose (item 4.11)</w:t>
+              <w:t xml:space="preserve">Rubber gaskets instead of PTFE (item 4.10)</w:t>
             </w:r>
           </w:p>
           <w:p>
@@ -16187,10 +16218,46 @@
                 <w:sz w:val="15"/>
                 <w:szCs w:val="15"/>
               </w:rPr>
-              <w:t xml:space="preserve">金属软管扭曲（第 4.11 项）</w:t>
-            </w:r>
-          </w:p>
-        </w:tc>
+              <w:t xml:space="preserve">使用橡胶垫片而非 PTFE 垫片（第 4.10 项）</w:t>
+            </w:r>
+          </w:p>
+        </w:tc>
+        <w:tc>
+          <w:tcPr>
+            <w:tcW w:type="dxa" w:w="5084"/>
+            <w:tcBorders>
+              <w:top w:val="none" w:color="FFFFFF" w:sz="0"/>
+              <w:left w:val="none" w:color="FFFFFF" w:sz="0"/>
+              <w:bottom w:val="none" w:color="FFFFFF" w:sz="0"/>
+              <w:right w:val="none" w:color="FFFFFF" w:sz="0"/>
+            </w:tcBorders>
+            <w:tcMar>
+              <w:top w:type="dxa" w:w="80"/>
+              <w:left w:type="dxa" w:w="120"/>
+              <w:bottom w:type="dxa" w:w="80"/>
+              <w:right w:type="dxa" w:w="120"/>
+            </w:tcMar>
+            <w:vAlign w:val="top"/>
+          </w:tcPr>
+          <w:p>
+            <w:pPr>
+              <w:spacing w:after="40" w:before="0" w:line="264"/>
+            </w:pPr>
+            <w:r>
+              <w:rPr>
+                <w:rFonts w:ascii="Calibri" w:cs="Calibri" w:eastAsia="Microsoft YaHei" w:hAnsi="Calibri"/>
+                <w:sz w:val="17"/>
+                <w:szCs w:val="17"/>
+              </w:rPr>
+              <w:t xml:space="preserve"/>
+            </w:r>
+          </w:p>
+        </w:tc>
+      </w:tr>
+      <w:tr>
+        <w:trPr>
+          <w:cantSplit/>
+        </w:trPr>
         <w:tc>
           <w:tcPr>
             <w:tcW w:type="dxa" w:w="5084"/>
@@ -16355,9 +16422,9 @@
             <w:r>
               <w:drawing>
                 <wp:inline distT="0" distB="0" distL="0" distR="0">
-                  <wp:extent cx="2295525" cy="1952625"/>
+                  <wp:extent cx="1466850" cy="1952625"/>
                   <wp:effectExtent t="0" r="0" b="0" l="0"/>
-                  <wp:docPr id="1" name="photo18" descr="Temporary props under the pipes instead of supports" title="Фото 18"/>
+                  <wp:docPr id="1" name="photo18" descr="Twisted flexible hose" title="Фото 18"/>
                   <wp:cNvGraphicFramePr>
                     <a:graphicFrameLocks xmlns:a="http://schemas.openxmlformats.org/drawingml/2006/main" noChangeAspect="1"/>
                   </wp:cNvGraphicFramePr>
@@ -16380,7 +16447,7 @@
                         <pic:spPr bwMode="auto">
                           <a:xfrm>
                             <a:off x="0" y="0"/>
-                            <a:ext cx="2295525" cy="1952625"/>
+                            <a:ext cx="1466850" cy="1952625"/>
                           </a:xfrm>
                           <a:prstGeom prst="rect">
                             <a:avLst/>
@@ -16415,7 +16482,7 @@
                 <w:sz w:val="15"/>
                 <w:szCs w:val="15"/>
               </w:rPr>
-              <w:t xml:space="preserve">Временные подставки под трубопроводами вместо опор (п. 4.12)</w:t>
+              <w:t xml:space="preserve">Скручивание гибкой подводки (п. 4.11)</w:t>
             </w:r>
           </w:p>
           <w:p>
@@ -16441,7 +16508,7 @@
                 <w:sz w:val="15"/>
                 <w:szCs w:val="15"/>
               </w:rPr>
-              <w:t xml:space="preserve">Temporary props under the pipes instead of supports (item 4.12)</w:t>
+              <w:t xml:space="preserve">Twisted flexible hose (item 4.11)</w:t>
             </w:r>
           </w:p>
           <w:p>
@@ -16467,15 +16534,10 @@
                 <w:sz w:val="15"/>
                 <w:szCs w:val="15"/>
               </w:rPr>
-              <w:t xml:space="preserve">管道下方为临时垫物而非支架（第 4.12 项）</w:t>
-            </w:r>
-          </w:p>
-        </w:tc>
-      </w:tr>
-      <w:tr>
-        <w:trPr>
-          <w:cantSplit/>
-        </w:trPr>
+              <w:t xml:space="preserve">金属软管扭曲（第 4.11 项）</w:t>
+            </w:r>
+          </w:p>
+        </w:tc>
         <w:tc>
           <w:tcPr>
             <w:tcW w:type="dxa" w:w="5084"/>
@@ -16500,9 +16562,9 @@
             <w:r>
               <w:drawing>
                 <wp:inline distT="0" distB="0" distL="0" distR="0">
-                  <wp:extent cx="2581275" cy="1952625"/>
+                  <wp:extent cx="2295525" cy="1952625"/>
                   <wp:effectExtent t="0" r="0" b="0" l="0"/>
-                  <wp:docPr id="1" name="photo19" descr="Pipes to be relocated below the second level floor" title="Фото 19"/>
+                  <wp:docPr id="1" name="photo19" descr="Temporary props under the pipes instead of supports" title="Фото 19"/>
                   <wp:cNvGraphicFramePr>
                     <a:graphicFrameLocks xmlns:a="http://schemas.openxmlformats.org/drawingml/2006/main" noChangeAspect="1"/>
                   </wp:cNvGraphicFramePr>
@@ -16525,7 +16587,7 @@
                         <pic:spPr bwMode="auto">
                           <a:xfrm>
                             <a:off x="0" y="0"/>
-                            <a:ext cx="2581275" cy="1952625"/>
+                            <a:ext cx="2295525" cy="1952625"/>
                           </a:xfrm>
                           <a:prstGeom prst="rect">
                             <a:avLst/>
@@ -16560,7 +16622,7 @@
                 <w:sz w:val="15"/>
                 <w:szCs w:val="15"/>
               </w:rPr>
-              <w:t xml:space="preserve">Трубопроводы, подлежащие переносу под пол второго этажа (п. 4.13)</w:t>
+              <w:t xml:space="preserve">Временные подставки под трубопроводами вместо опор (п. 4.12)</w:t>
             </w:r>
           </w:p>
           <w:p>
@@ -16586,7 +16648,7 @@
                 <w:sz w:val="15"/>
                 <w:szCs w:val="15"/>
               </w:rPr>
-              <w:t xml:space="preserve">Pipes to be relocated below the second level floor (item 4.13)</w:t>
+              <w:t xml:space="preserve">Temporary props under the pipes instead of supports (item 4.12)</w:t>
             </w:r>
           </w:p>
           <w:p>
@@ -16612,10 +16674,15 @@
                 <w:sz w:val="15"/>
                 <w:szCs w:val="15"/>
               </w:rPr>
-              <w:t xml:space="preserve">须移至第二层地板下方的管路（第 4.13 项）</w:t>
-            </w:r>
-          </w:p>
-        </w:tc>
+              <w:t xml:space="preserve">管道下方为临时垫物而非支架（第 4.12 项）</w:t>
+            </w:r>
+          </w:p>
+        </w:tc>
+      </w:tr>
+      <w:tr>
+        <w:trPr>
+          <w:cantSplit/>
+        </w:trPr>
         <w:tc>
           <w:tcPr>
             <w:tcW w:type="dxa" w:w="5084"/>
@@ -16640,9 +16707,9 @@
             <w:r>
               <w:drawing>
                 <wp:inline distT="0" distB="0" distL="0" distR="0">
-                  <wp:extent cx="2857500" cy="1609725"/>
+                  <wp:extent cx="2581275" cy="1952625"/>
                   <wp:effectExtent t="0" r="0" b="0" l="0"/>
-                  <wp:docPr id="1" name="photo20" descr="Cable armour not secured" title="Фото 20"/>
+                  <wp:docPr id="1" name="photo20" descr="Pipes to be relocated below the second level floor" title="Фото 20"/>
                   <wp:cNvGraphicFramePr>
                     <a:graphicFrameLocks xmlns:a="http://schemas.openxmlformats.org/drawingml/2006/main" noChangeAspect="1"/>
                   </wp:cNvGraphicFramePr>
@@ -16665,7 +16732,7 @@
                         <pic:spPr bwMode="auto">
                           <a:xfrm>
                             <a:off x="0" y="0"/>
-                            <a:ext cx="2857500" cy="1609725"/>
+                            <a:ext cx="2581275" cy="1952625"/>
                           </a:xfrm>
                           <a:prstGeom prst="rect">
                             <a:avLst/>
@@ -16700,7 +16767,7 @@
                 <w:sz w:val="15"/>
                 <w:szCs w:val="15"/>
               </w:rPr>
-              <w:t xml:space="preserve">Не закреплена броня кабелей (п. 5.1)</w:t>
+              <w:t xml:space="preserve">Трубопроводы, подлежащие переносу под пол второго этажа (п. 4.13)</w:t>
             </w:r>
           </w:p>
           <w:p>
@@ -16726,7 +16793,7 @@
                 <w:sz w:val="15"/>
                 <w:szCs w:val="15"/>
               </w:rPr>
-              <w:t xml:space="preserve">Cable armour not secured (item 5.1)</w:t>
+              <w:t xml:space="preserve">Pipes to be relocated below the second level floor (item 4.13)</w:t>
             </w:r>
           </w:p>
           <w:p>
@@ -16752,7 +16819,7 @@
                 <w:sz w:val="15"/>
                 <w:szCs w:val="15"/>
               </w:rPr>
-              <w:t xml:space="preserve">电缆铠装层未固定（第 5.1 项）</w:t>
+              <w:t xml:space="preserve">须移至第二层地板下方的管路（第 4.13 项）</w:t>
             </w:r>
           </w:p>
         </w:tc>
@@ -16782,7 +16849,7 @@
                 <wp:inline distT="0" distB="0" distL="0" distR="0">
                   <wp:extent cx="2857500" cy="1609725"/>
                   <wp:effectExtent t="0" r="0" b="0" l="0"/>
-                  <wp:docPr id="1" name="photo21" descr="Damaged temperature sensor cable" title="Фото 21"/>
+                  <wp:docPr id="1" name="photo21" descr="Cable armour not secured" title="Фото 21"/>
                   <wp:cNvGraphicFramePr>
                     <a:graphicFrameLocks xmlns:a="http://schemas.openxmlformats.org/drawingml/2006/main" noChangeAspect="1"/>
                   </wp:cNvGraphicFramePr>
@@ -16840,7 +16907,7 @@
                 <w:sz w:val="15"/>
                 <w:szCs w:val="15"/>
               </w:rPr>
-              <w:t xml:space="preserve">Перебит кабель датчика температуры (п. 5.4)</w:t>
+              <w:t xml:space="preserve">Не закреплена броня кабелей (п. 5.1)</w:t>
             </w:r>
           </w:p>
           <w:p>
@@ -16866,7 +16933,7 @@
                 <w:sz w:val="15"/>
                 <w:szCs w:val="15"/>
               </w:rPr>
-              <w:t xml:space="preserve">Damaged temperature sensor cable (item 5.4)</w:t>
+              <w:t xml:space="preserve">Cable armour not secured (item 5.1)</w:t>
             </w:r>
           </w:p>
           <w:p>
@@ -16892,7 +16959,38 @@
                 <w:sz w:val="15"/>
                 <w:szCs w:val="15"/>
               </w:rPr>
-              <w:t xml:space="preserve">温度传感器电缆被压损（第 5.4 项）</w:t>
+              <w:t xml:space="preserve">电缆铠装层未固定（第 5.1 项）</w:t>
+            </w:r>
+          </w:p>
+        </w:tc>
+        <w:tc>
+          <w:tcPr>
+            <w:tcW w:type="dxa" w:w="5084"/>
+            <w:tcBorders>
+              <w:top w:val="none" w:color="FFFFFF" w:sz="0"/>
+              <w:left w:val="none" w:color="FFFFFF" w:sz="0"/>
+              <w:bottom w:val="none" w:color="FFFFFF" w:sz="0"/>
+              <w:right w:val="none" w:color="FFFFFF" w:sz="0"/>
+            </w:tcBorders>
+            <w:tcMar>
+              <w:top w:type="dxa" w:w="80"/>
+              <w:left w:type="dxa" w:w="120"/>
+              <w:bottom w:type="dxa" w:w="80"/>
+              <w:right w:type="dxa" w:w="120"/>
+            </w:tcMar>
+            <w:vAlign w:val="top"/>
+          </w:tcPr>
+          <w:p>
+            <w:pPr>
+              <w:spacing w:after="40" w:before="0" w:line="264"/>
+            </w:pPr>
+            <w:r>
+              <w:rPr>
+                <w:rFonts w:ascii="Calibri" w:cs="Calibri" w:eastAsia="Microsoft YaHei" w:hAnsi="Calibri"/>
+                <w:sz w:val="17"/>
+                <w:szCs w:val="17"/>
+              </w:rPr>
+              <w:t xml:space="preserve"/>
             </w:r>
           </w:p>
         </w:tc>
@@ -16927,7 +17025,7 @@
                 <wp:inline distT="0" distB="0" distL="0" distR="0">
                   <wp:extent cx="2857500" cy="1609725"/>
                   <wp:effectExtent t="0" r="0" b="0" l="0"/>
-                  <wp:docPr id="1" name="photo22" descr="Location of the temperature sensor cable damage" title="Фото 22"/>
+                  <wp:docPr id="1" name="photo22" descr="Damaged temperature sensor cable" title="Фото 22"/>
                   <wp:cNvGraphicFramePr>
                     <a:graphicFrameLocks xmlns:a="http://schemas.openxmlformats.org/drawingml/2006/main" noChangeAspect="1"/>
                   </wp:cNvGraphicFramePr>
@@ -16985,7 +17083,7 @@
                 <w:sz w:val="15"/>
                 <w:szCs w:val="15"/>
               </w:rPr>
-              <w:t xml:space="preserve">Место повреждения кабеля датчика температуры (п. 5.4)</w:t>
+              <w:t xml:space="preserve">Перебит кабель датчика температуры (п. 5.4)</w:t>
             </w:r>
           </w:p>
           <w:p>
@@ -17011,7 +17109,7 @@
                 <w:sz w:val="15"/>
                 <w:szCs w:val="15"/>
               </w:rPr>
-              <w:t xml:space="preserve">Location of the temperature sensor cable damage (item 5.4)</w:t>
+              <w:t xml:space="preserve">Damaged temperature sensor cable (item 5.4)</w:t>
             </w:r>
           </w:p>
           <w:p>
@@ -17037,7 +17135,7 @@
                 <w:sz w:val="15"/>
                 <w:szCs w:val="15"/>
               </w:rPr>
-              <w:t xml:space="preserve">温度传感器电缆损坏位置（第 5.4 项）</w:t>
+              <w:t xml:space="preserve">温度传感器电缆被压损（第 5.4 项）</w:t>
             </w:r>
           </w:p>
         </w:tc>
@@ -17065,9 +17163,9 @@
             <w:r>
               <w:drawing>
                 <wp:inline distT="0" distB="0" distL="0" distR="0">
-                  <wp:extent cx="1095375" cy="1952625"/>
+                  <wp:extent cx="2857500" cy="1609725"/>
                   <wp:effectExtent t="0" r="0" b="0" l="0"/>
-                  <wp:docPr id="1" name="photo23" descr="Cable conduits not secured" title="Фото 23"/>
+                  <wp:docPr id="1" name="photo23" descr="Location of the temperature sensor cable damage" title="Фото 23"/>
                   <wp:cNvGraphicFramePr>
                     <a:graphicFrameLocks xmlns:a="http://schemas.openxmlformats.org/drawingml/2006/main" noChangeAspect="1"/>
                   </wp:cNvGraphicFramePr>
@@ -17090,7 +17188,7 @@
                         <pic:spPr bwMode="auto">
                           <a:xfrm>
                             <a:off x="0" y="0"/>
-                            <a:ext cx="1095375" cy="1952625"/>
+                            <a:ext cx="2857500" cy="1609725"/>
                           </a:xfrm>
                           <a:prstGeom prst="rect">
                             <a:avLst/>
@@ -17125,7 +17223,7 @@
                 <w:sz w:val="15"/>
                 <w:szCs w:val="15"/>
               </w:rPr>
-              <w:t xml:space="preserve">Не закреплены трубы кабельной разводки (п. 5.5)</w:t>
+              <w:t xml:space="preserve">Место повреждения кабеля датчика температуры (п. 5.4)</w:t>
             </w:r>
           </w:p>
           <w:p>
@@ -17151,7 +17249,7 @@
                 <w:sz w:val="15"/>
                 <w:szCs w:val="15"/>
               </w:rPr>
-              <w:t xml:space="preserve">Cable conduits not secured (item 5.5)</w:t>
+              <w:t xml:space="preserve">Location of the temperature sensor cable damage (item 5.4)</w:t>
             </w:r>
           </w:p>
           <w:p>
@@ -17177,7 +17275,7 @@
                 <w:sz w:val="15"/>
                 <w:szCs w:val="15"/>
               </w:rPr>
-              <w:t xml:space="preserve">电缆保护管未固定（第 5.5 项）</w:t>
+              <w:t xml:space="preserve">温度传感器电缆损坏位置（第 5.4 项）</w:t>
             </w:r>
           </w:p>
         </w:tc>
@@ -17205,9 +17303,9 @@
             <w:r>
               <w:drawing>
                 <wp:inline distT="0" distB="0" distL="0" distR="0">
-                  <wp:extent cx="1466850" cy="1952625"/>
+                  <wp:extent cx="1095375" cy="1952625"/>
                   <wp:effectExtent t="0" r="0" b="0" l="0"/>
-                  <wp:docPr id="1" name="photo24" descr="Marking missing on the Pirani gauges" title="Фото 24"/>
+                  <wp:docPr id="1" name="photo24" descr="Cable conduits not secured" title="Фото 24"/>
                   <wp:cNvGraphicFramePr>
                     <a:graphicFrameLocks xmlns:a="http://schemas.openxmlformats.org/drawingml/2006/main" noChangeAspect="1"/>
                   </wp:cNvGraphicFramePr>
@@ -17230,6 +17328,151 @@
                         <pic:spPr bwMode="auto">
                           <a:xfrm>
                             <a:off x="0" y="0"/>
+                            <a:ext cx="1095375" cy="1952625"/>
+                          </a:xfrm>
+                          <a:prstGeom prst="rect">
+                            <a:avLst/>
+                          </a:prstGeom>
+                        </pic:spPr>
+                      </pic:pic>
+                    </a:graphicData>
+                  </a:graphic>
+                </wp:inline>
+              </w:drawing>
+            </w:r>
+          </w:p>
+          <w:p>
+            <w:pPr>
+              <w:spacing w:after="0" w:before="60"/>
+              <w:jc w:val="center"/>
+            </w:pPr>
+            <w:r>
+              <w:rPr>
+                <w:rFonts w:ascii="Calibri" w:cs="Calibri" w:eastAsia="Microsoft YaHei" w:hAnsi="Calibri"/>
+                <w:b/>
+                <w:bCs/>
+                <w:color w:val="B4541A"/>
+                <w:sz w:val="15"/>
+                <w:szCs w:val="15"/>
+              </w:rPr>
+              <w:t xml:space="preserve">Фото 24. </w:t>
+            </w:r>
+            <w:r>
+              <w:rPr>
+                <w:rFonts w:ascii="Calibri" w:cs="Calibri" w:eastAsia="Microsoft YaHei" w:hAnsi="Calibri"/>
+                <w:sz w:val="15"/>
+                <w:szCs w:val="15"/>
+              </w:rPr>
+              <w:t xml:space="preserve">Не закреплены трубы кабельной разводки (п. 5.5)</w:t>
+            </w:r>
+          </w:p>
+          <w:p>
+            <w:pPr>
+              <w:spacing w:after="0"/>
+              <w:jc w:val="center"/>
+            </w:pPr>
+            <w:r>
+              <w:rPr>
+                <w:rFonts w:ascii="Calibri" w:cs="Calibri" w:eastAsia="Microsoft YaHei" w:hAnsi="Calibri"/>
+                <w:b/>
+                <w:bCs/>
+                <w:color w:val="B4541A"/>
+                <w:sz w:val="15"/>
+                <w:szCs w:val="15"/>
+              </w:rPr>
+              <w:t xml:space="preserve">Photo 24. </w:t>
+            </w:r>
+            <w:r>
+              <w:rPr>
+                <w:rFonts w:ascii="Calibri" w:cs="Calibri" w:eastAsia="Microsoft YaHei" w:hAnsi="Calibri"/>
+                <w:color w:val="44546A"/>
+                <w:sz w:val="15"/>
+                <w:szCs w:val="15"/>
+              </w:rPr>
+              <w:t xml:space="preserve">Cable conduits not secured (item 5.5)</w:t>
+            </w:r>
+          </w:p>
+          <w:p>
+            <w:pPr>
+              <w:spacing w:after="0"/>
+              <w:jc w:val="center"/>
+            </w:pPr>
+            <w:r>
+              <w:rPr>
+                <w:rFonts w:ascii="Calibri" w:cs="Calibri" w:eastAsia="Microsoft YaHei" w:hAnsi="Calibri"/>
+                <w:b/>
+                <w:bCs/>
+                <w:color w:val="B4541A"/>
+                <w:sz w:val="15"/>
+                <w:szCs w:val="15"/>
+              </w:rPr>
+              <w:t xml:space="preserve">照片 24. </w:t>
+            </w:r>
+            <w:r>
+              <w:rPr>
+                <w:rFonts w:ascii="Calibri" w:cs="Calibri" w:eastAsia="Microsoft YaHei" w:hAnsi="Calibri"/>
+                <w:color w:val="44546A"/>
+                <w:sz w:val="15"/>
+                <w:szCs w:val="15"/>
+              </w:rPr>
+              <w:t xml:space="preserve">电缆保护管未固定（第 5.5 项）</w:t>
+            </w:r>
+          </w:p>
+        </w:tc>
+      </w:tr>
+      <w:tr>
+        <w:trPr>
+          <w:cantSplit/>
+        </w:trPr>
+        <w:tc>
+          <w:tcPr>
+            <w:tcW w:type="dxa" w:w="5084"/>
+            <w:tcBorders>
+              <w:top w:val="none" w:color="FFFFFF" w:sz="0"/>
+              <w:left w:val="none" w:color="FFFFFF" w:sz="0"/>
+              <w:bottom w:val="none" w:color="FFFFFF" w:sz="0"/>
+              <w:right w:val="none" w:color="FFFFFF" w:sz="0"/>
+            </w:tcBorders>
+            <w:tcMar>
+              <w:top w:type="dxa" w:w="60"/>
+              <w:left w:type="dxa" w:w="120"/>
+              <w:bottom w:type="dxa" w:w="160"/>
+              <w:right w:type="dxa" w:w="120"/>
+            </w:tcMar>
+            <w:vAlign w:val="bottom"/>
+          </w:tcPr>
+          <w:p>
+            <w:pPr>
+              <w:jc w:val="center"/>
+            </w:pPr>
+            <w:r>
+              <w:drawing>
+                <wp:inline distT="0" distB="0" distL="0" distR="0">
+                  <wp:extent cx="1466850" cy="1952625"/>
+                  <wp:effectExtent t="0" r="0" b="0" l="0"/>
+                  <wp:docPr id="1" name="photo25" descr="Marking missing on the Pirani gauges" title="Фото 25"/>
+                  <wp:cNvGraphicFramePr>
+                    <a:graphicFrameLocks xmlns:a="http://schemas.openxmlformats.org/drawingml/2006/main" noChangeAspect="1"/>
+                  </wp:cNvGraphicFramePr>
+                  <a:graphic xmlns:a="http://schemas.openxmlformats.org/drawingml/2006/main">
+                    <a:graphicData uri="http://schemas.openxmlformats.org/drawingml/2006/picture">
+                      <pic:pic xmlns:pic="http://schemas.openxmlformats.org/drawingml/2006/picture">
+                        <pic:nvPicPr>
+                          <pic:cNvPr id="0" name="" descr=""/>
+                          <pic:cNvPicPr>
+                            <a:picLocks noChangeAspect="1" noChangeArrowheads="1"/>
+                          </pic:cNvPicPr>
+                        </pic:nvPicPr>
+                        <pic:blipFill>
+                          <a:blip r:embed="rId33" cstate="none"/>
+                          <a:srcRect/>
+                          <a:stretch>
+                            <a:fillRect/>
+                          </a:stretch>
+                        </pic:blipFill>
+                        <pic:spPr bwMode="auto">
+                          <a:xfrm>
+                            <a:off x="0" y="0"/>
                             <a:ext cx="1466850" cy="1952625"/>
                           </a:xfrm>
                           <a:prstGeom prst="rect">
@@ -17257,7 +17500,7 @@
                 <w:sz w:val="15"/>
                 <w:szCs w:val="15"/>
               </w:rPr>
-              <w:t xml:space="preserve">Фото 24. </w:t>
+              <w:t xml:space="preserve">Фото 25. </w:t>
             </w:r>
             <w:r>
               <w:rPr>
@@ -17282,7 +17525,7 @@
                 <w:sz w:val="15"/>
                 <w:szCs w:val="15"/>
               </w:rPr>
-              <w:t xml:space="preserve">Photo 24. </w:t>
+              <w:t xml:space="preserve">Photo 25. </w:t>
             </w:r>
             <w:r>
               <w:rPr>
@@ -17308,7 +17551,7 @@
                 <w:sz w:val="15"/>
                 <w:szCs w:val="15"/>
               </w:rPr>
-              <w:t xml:space="preserve">照片 24. </w:t>
+              <w:t xml:space="preserve">照片 25. </w:t>
             </w:r>
             <w:r>
               <w:rPr>
@@ -17318,6 +17561,68 @@
                 <w:szCs w:val="15"/>
               </w:rPr>
               <w:t xml:space="preserve">皮拉尼真空计缺少标识（第 5.6 项）</w:t>
+            </w:r>
+          </w:p>
+        </w:tc>
+        <w:tc>
+          <w:tcPr>
+            <w:tcW w:type="dxa" w:w="5084"/>
+            <w:tcBorders>
+              <w:top w:val="none" w:color="FFFFFF" w:sz="0"/>
+              <w:left w:val="none" w:color="FFFFFF" w:sz="0"/>
+              <w:bottom w:val="none" w:color="FFFFFF" w:sz="0"/>
+              <w:right w:val="none" w:color="FFFFFF" w:sz="0"/>
+            </w:tcBorders>
+            <w:tcMar>
+              <w:top w:type="dxa" w:w="80"/>
+              <w:left w:type="dxa" w:w="120"/>
+              <w:bottom w:type="dxa" w:w="80"/>
+              <w:right w:type="dxa" w:w="120"/>
+            </w:tcMar>
+            <w:vAlign w:val="top"/>
+          </w:tcPr>
+          <w:p>
+            <w:pPr>
+              <w:spacing w:after="40" w:before="0" w:line="264"/>
+            </w:pPr>
+            <w:r>
+              <w:rPr>
+                <w:rFonts w:ascii="Calibri" w:cs="Calibri" w:eastAsia="Microsoft YaHei" w:hAnsi="Calibri"/>
+                <w:sz w:val="17"/>
+                <w:szCs w:val="17"/>
+              </w:rPr>
+              <w:t xml:space="preserve"/>
+            </w:r>
+          </w:p>
+        </w:tc>
+        <w:tc>
+          <w:tcPr>
+            <w:tcW w:type="dxa" w:w="5084"/>
+            <w:tcBorders>
+              <w:top w:val="none" w:color="FFFFFF" w:sz="0"/>
+              <w:left w:val="none" w:color="FFFFFF" w:sz="0"/>
+              <w:bottom w:val="none" w:color="FFFFFF" w:sz="0"/>
+              <w:right w:val="none" w:color="FFFFFF" w:sz="0"/>
+            </w:tcBorders>
+            <w:tcMar>
+              <w:top w:type="dxa" w:w="80"/>
+              <w:left w:type="dxa" w:w="120"/>
+              <w:bottom w:type="dxa" w:w="80"/>
+              <w:right w:type="dxa" w:w="120"/>
+            </w:tcMar>
+            <w:vAlign w:val="top"/>
+          </w:tcPr>
+          <w:p>
+            <w:pPr>
+              <w:spacing w:after="40" w:before="0" w:line="264"/>
+            </w:pPr>
+            <w:r>
+              <w:rPr>
+                <w:rFonts w:ascii="Calibri" w:cs="Calibri" w:eastAsia="Microsoft YaHei" w:hAnsi="Calibri"/>
+                <w:sz w:val="17"/>
+                <w:szCs w:val="17"/>
+              </w:rPr>
+              <w:t xml:space="preserve"/>
             </w:r>
           </w:p>
         </w:tc>

</xml_diff>